<commit_message>
updated new two features that would help segregating c1, c3, c4
</commit_message>
<xml_diff>
--- a/documents/TeleLog RCA Project – Progress Summary.docx
+++ b/documents/TeleLog RCA Project – Progress Summary.docx
@@ -754,8 +754,8 @@
         <w:rPr>
           <w:noProof/>
         </w:rPr>
-        <w:pict w14:anchorId="5996B464">
-          <v:rect id="_x0000_i1048" alt="" style="width:468pt;height:.05pt;mso-width-percent:0;mso-height-percent:0;mso-width-percent:0;mso-height-percent:0" o:hralign="center" o:hrstd="t" o:hr="t"/>
+        <w:pict w14:anchorId="796E2257">
+          <v:rect id="_x0000_i1055" alt="" style="width:468pt;height:.05pt;mso-width-percent:0;mso-height-percent:0;mso-width-percent:0;mso-height-percent:0" o:hralign="center" o:hrstd="t" o:hr="t"/>
         </w:pict>
       </w:r>
     </w:p>
@@ -845,8 +845,8 @@
         <w:rPr>
           <w:noProof/>
         </w:rPr>
-        <w:pict w14:anchorId="44D6CC56">
-          <v:rect id="_x0000_i1047" alt="" style="width:468pt;height:.05pt;mso-width-percent:0;mso-height-percent:0;mso-width-percent:0;mso-height-percent:0" o:hralign="center" o:hrstd="t" o:hr="t"/>
+        <w:pict w14:anchorId="719D701A">
+          <v:rect id="_x0000_i1054" alt="" style="width:468pt;height:.05pt;mso-width-percent:0;mso-height-percent:0;mso-width-percent:0;mso-height-percent:0" o:hralign="center" o:hrstd="t" o:hr="t"/>
         </w:pict>
       </w:r>
     </w:p>
@@ -998,8 +998,8 @@
         <w:rPr>
           <w:noProof/>
         </w:rPr>
-        <w:pict w14:anchorId="06D4FD7A">
-          <v:rect id="_x0000_i1046" alt="" style="width:468pt;height:.05pt;mso-width-percent:0;mso-height-percent:0;mso-width-percent:0;mso-height-percent:0" o:hralign="center" o:hrstd="t" o:hr="t"/>
+        <w:pict w14:anchorId="62E0CAA9">
+          <v:rect id="_x0000_i1053" alt="" style="width:468pt;height:.05pt;mso-width-percent:0;mso-height-percent:0;mso-width-percent:0;mso-height-percent:0" o:hralign="center" o:hrstd="t" o:hr="t"/>
         </w:pict>
       </w:r>
     </w:p>
@@ -1214,8 +1214,8 @@
         <w:rPr>
           <w:noProof/>
         </w:rPr>
-        <w:pict w14:anchorId="0A19DC82">
-          <v:rect id="_x0000_i1045" alt="" style="width:468pt;height:.05pt;mso-width-percent:0;mso-height-percent:0;mso-width-percent:0;mso-height-percent:0" o:hralign="center" o:hrstd="t" o:hr="t"/>
+        <w:pict w14:anchorId="370F9939">
+          <v:rect id="_x0000_i1052" alt="" style="width:468pt;height:.05pt;mso-width-percent:0;mso-height-percent:0;mso-width-percent:0;mso-height-percent:0" o:hralign="center" o:hrstd="t" o:hr="t"/>
         </w:pict>
       </w:r>
     </w:p>
@@ -1318,8 +1318,8 @@
         <w:rPr>
           <w:noProof/>
         </w:rPr>
-        <w:pict w14:anchorId="77B620C4">
-          <v:rect id="_x0000_i1044" alt="" style="width:468pt;height:.05pt;mso-width-percent:0;mso-height-percent:0;mso-width-percent:0;mso-height-percent:0" o:hralign="center" o:hrstd="t" o:hr="t"/>
+        <w:pict w14:anchorId="13E9140E">
+          <v:rect id="_x0000_i1051" alt="" style="width:468pt;height:.05pt;mso-width-percent:0;mso-height-percent:0;mso-width-percent:0;mso-height-percent:0" o:hralign="center" o:hrstd="t" o:hr="t"/>
         </w:pict>
       </w:r>
     </w:p>
@@ -1422,8 +1422,8 @@
         <w:rPr>
           <w:noProof/>
         </w:rPr>
-        <w:pict w14:anchorId="38636CDB">
-          <v:rect id="_x0000_i1043" alt="" style="width:468pt;height:.05pt;mso-width-percent:0;mso-height-percent:0;mso-width-percent:0;mso-height-percent:0" o:hralign="center" o:hrstd="t" o:hr="t"/>
+        <w:pict w14:anchorId="47D5BF78">
+          <v:rect id="_x0000_i1050" alt="" style="width:468pt;height:.05pt;mso-width-percent:0;mso-height-percent:0;mso-width-percent:0;mso-height-percent:0" o:hralign="center" o:hrstd="t" o:hr="t"/>
         </w:pict>
       </w:r>
     </w:p>
@@ -1530,8 +1530,8 @@
         <w:rPr>
           <w:noProof/>
         </w:rPr>
-        <w:pict w14:anchorId="0329A959">
-          <v:rect id="_x0000_i1042" alt="" style="width:468pt;height:.05pt;mso-width-percent:0;mso-height-percent:0;mso-width-percent:0;mso-height-percent:0" o:hralign="center" o:hrstd="t" o:hr="t"/>
+        <w:pict w14:anchorId="3748C42D">
+          <v:rect id="_x0000_i1049" alt="" style="width:468pt;height:.05pt;mso-width-percent:0;mso-height-percent:0;mso-width-percent:0;mso-height-percent:0" o:hralign="center" o:hrstd="t" o:hr="t"/>
         </w:pict>
       </w:r>
     </w:p>
@@ -1622,8 +1622,8 @@
         <w:rPr>
           <w:noProof/>
         </w:rPr>
-        <w:pict w14:anchorId="240DE888">
-          <v:rect id="_x0000_i1041" alt="" style="width:468pt;height:.05pt;mso-width-percent:0;mso-height-percent:0;mso-width-percent:0;mso-height-percent:0" o:hralign="center" o:hrstd="t" o:hr="t"/>
+        <w:pict w14:anchorId="4DB77E50">
+          <v:rect id="_x0000_i1048" alt="" style="width:468pt;height:.05pt;mso-width-percent:0;mso-height-percent:0;mso-width-percent:0;mso-height-percent:0" o:hralign="center" o:hrstd="t" o:hr="t"/>
         </w:pict>
       </w:r>
     </w:p>
@@ -1762,8 +1762,8 @@
         <w:rPr>
           <w:noProof/>
         </w:rPr>
-        <w:pict w14:anchorId="55882288">
-          <v:rect id="_x0000_i1040" alt="" style="width:468pt;height:.05pt;mso-width-percent:0;mso-height-percent:0;mso-width-percent:0;mso-height-percent:0" o:hralign="center" o:hrstd="t" o:hr="t"/>
+        <w:pict w14:anchorId="272DC5D5">
+          <v:rect id="_x0000_i1047" alt="" style="width:468pt;height:.05pt;mso-width-percent:0;mso-height-percent:0;mso-width-percent:0;mso-height-percent:0" o:hralign="center" o:hrstd="t" o:hr="t"/>
         </w:pict>
       </w:r>
     </w:p>
@@ -1853,8 +1853,8 @@
         <w:rPr>
           <w:noProof/>
         </w:rPr>
-        <w:pict w14:anchorId="0D2C20B7">
-          <v:rect id="_x0000_i1039" alt="" style="width:468pt;height:.05pt;mso-width-percent:0;mso-height-percent:0;mso-width-percent:0;mso-height-percent:0" o:hralign="center" o:hrstd="t" o:hr="t"/>
+        <w:pict w14:anchorId="4D1DFCBF">
+          <v:rect id="_x0000_i1046" alt="" style="width:468pt;height:.05pt;mso-width-percent:0;mso-height-percent:0;mso-width-percent:0;mso-height-percent:0" o:hralign="center" o:hrstd="t" o:hr="t"/>
         </w:pict>
       </w:r>
     </w:p>
@@ -1961,8 +1961,8 @@
         <w:rPr>
           <w:noProof/>
         </w:rPr>
-        <w:pict w14:anchorId="00E1A4CF">
-          <v:rect id="_x0000_i1038" alt="" style="width:468pt;height:.05pt;mso-width-percent:0;mso-height-percent:0;mso-width-percent:0;mso-height-percent:0" o:hralign="center" o:hrstd="t" o:hr="t"/>
+        <w:pict w14:anchorId="30492E34">
+          <v:rect id="_x0000_i1045" alt="" style="width:468pt;height:.05pt;mso-width-percent:0;mso-height-percent:0;mso-width-percent:0;mso-height-percent:0" o:hralign="center" o:hrstd="t" o:hr="t"/>
         </w:pict>
       </w:r>
     </w:p>
@@ -2077,8 +2077,8 @@
         <w:rPr>
           <w:noProof/>
         </w:rPr>
-        <w:pict w14:anchorId="2066BC71">
-          <v:rect id="_x0000_i1037" alt="" style="width:468pt;height:.05pt;mso-width-percent:0;mso-height-percent:0;mso-width-percent:0;mso-height-percent:0" o:hralign="center" o:hrstd="t" o:hr="t"/>
+        <w:pict w14:anchorId="633CBDFD">
+          <v:rect id="_x0000_i1044" alt="" style="width:468pt;height:.05pt;mso-width-percent:0;mso-height-percent:0;mso-width-percent:0;mso-height-percent:0" o:hralign="center" o:hrstd="t" o:hr="t"/>
         </w:pict>
       </w:r>
     </w:p>
@@ -2158,8 +2158,8 @@
         <w:rPr>
           <w:noProof/>
         </w:rPr>
-        <w:pict w14:anchorId="0299F56D">
-          <v:rect id="_x0000_i1036" alt="" style="width:468pt;height:.05pt;mso-width-percent:0;mso-height-percent:0;mso-width-percent:0;mso-height-percent:0" o:hralign="center" o:hrstd="t" o:hr="t"/>
+        <w:pict w14:anchorId="6787B432">
+          <v:rect id="_x0000_i1043" alt="" style="width:468pt;height:.05pt;mso-width-percent:0;mso-height-percent:0;mso-width-percent:0;mso-height-percent:0" o:hralign="center" o:hrstd="t" o:hr="t"/>
         </w:pict>
       </w:r>
     </w:p>
@@ -2490,8 +2490,8 @@
           <w:noProof/>
         </w:rPr>
         <w:lastRenderedPageBreak/>
-        <w:pict w14:anchorId="4F943FAC">
-          <v:rect id="_x0000_i1035" alt="" style="width:468pt;height:.05pt;mso-width-percent:0;mso-height-percent:0;mso-width-percent:0;mso-height-percent:0" o:hralign="center" o:hrstd="t" o:hr="t"/>
+        <w:pict w14:anchorId="4F7C696D">
+          <v:rect id="_x0000_i1042" alt="" style="width:468pt;height:.05pt;mso-width-percent:0;mso-height-percent:0;mso-width-percent:0;mso-height-percent:0" o:hralign="center" o:hrstd="t" o:hr="t"/>
         </w:pict>
       </w:r>
     </w:p>
@@ -2836,7 +2836,1111 @@
         <w:rPr>
           <w:noProof/>
         </w:rPr>
-        <w:pict w14:anchorId="679E22DE">
+        <w:pict w14:anchorId="69C8D874">
+          <v:rect id="_x0000_i1041" alt="" style="width:468pt;height:.05pt;mso-width-percent:0;mso-height-percent:0;mso-width-percent:0;mso-height-percent:0" o:hralign="center" o:hrstd="t" o:hr="t" fillcolor="#a0a0a0" stroked="f"/>
+        </w:pict>
+      </w:r>
+    </w:p>
+    <w:p>
+      <w:pPr>
+        <w:pStyle w:val="Heading3"/>
+      </w:pPr>
+      <w:r>
+        <w:t xml:space="preserve">2. C8 (Resource Insufficiency) Forms a Distinct Cluster </w:t>
+      </w:r>
+      <w:r>
+        <w:rPr>
+          <w:rFonts w:ascii="Apple Color Emoji" w:hAnsi="Apple Color Emoji" w:cs="Apple Color Emoji"/>
+        </w:rPr>
+        <w:t>⭐⭐⭐⭐⭐</w:t>
+      </w:r>
+    </w:p>
+    <w:p>
+      <w:pPr>
+        <w:numPr>
+          <w:ilvl w:val="0"/>
+          <w:numId w:val="54"/>
+        </w:numPr>
+        <w:spacing w:before="100" w:beforeAutospacing="1" w:after="100" w:afterAutospacing="1"/>
+      </w:pPr>
+      <w:r>
+        <w:rPr>
+          <w:rStyle w:val="Strong"/>
+        </w:rPr>
+        <w:t>C8 clearly separated from other RCA categories</w:t>
+      </w:r>
+      <w:r>
+        <w:t xml:space="preserve"> in RB-related analysis.</w:t>
+      </w:r>
+    </w:p>
+    <w:p>
+      <w:pPr>
+        <w:numPr>
+          <w:ilvl w:val="0"/>
+          <w:numId w:val="54"/>
+        </w:numPr>
+        <w:spacing w:before="100" w:beforeAutospacing="1" w:after="100" w:afterAutospacing="1"/>
+      </w:pPr>
+      <w:r>
+        <w:t>Observed:</w:t>
+      </w:r>
+    </w:p>
+    <w:p>
+      <w:pPr>
+        <w:numPr>
+          <w:ilvl w:val="1"/>
+          <w:numId w:val="54"/>
+        </w:numPr>
+        <w:spacing w:before="100" w:beforeAutospacing="1" w:after="100" w:afterAutospacing="1"/>
+      </w:pPr>
+      <w:r>
+        <w:t>lower average RB allocation</w:t>
+      </w:r>
+    </w:p>
+    <w:p>
+      <w:pPr>
+        <w:numPr>
+          <w:ilvl w:val="1"/>
+          <w:numId w:val="54"/>
+        </w:numPr>
+        <w:spacing w:before="100" w:beforeAutospacing="1" w:after="100" w:afterAutospacing="1"/>
+      </w:pPr>
+      <w:r>
+        <w:t>higher percentage of time with RB &lt; 160</w:t>
+      </w:r>
+    </w:p>
+    <w:p>
+      <w:pPr>
+        <w:numPr>
+          <w:ilvl w:val="1"/>
+          <w:numId w:val="54"/>
+        </w:numPr>
+        <w:spacing w:before="100" w:beforeAutospacing="1" w:after="100" w:afterAutospacing="1"/>
+      </w:pPr>
+      <w:r>
+        <w:t>lower RB allocation during low-throughput periods</w:t>
+      </w:r>
+    </w:p>
+    <w:p>
+      <w:pPr>
+        <w:numPr>
+          <w:ilvl w:val="0"/>
+          <w:numId w:val="54"/>
+        </w:numPr>
+        <w:spacing w:before="100" w:beforeAutospacing="1" w:after="100" w:afterAutospacing="1"/>
+      </w:pPr>
+      <w:r>
+        <w:t xml:space="preserve">C8 formed a visually distinct cluster in </w:t>
+      </w:r>
+      <w:r>
+        <w:rPr>
+          <w:rStyle w:val="Strong"/>
+        </w:rPr>
+        <w:t>Throughput vs RB</w:t>
+      </w:r>
+      <w:r>
+        <w:t xml:space="preserve"> plots.</w:t>
+      </w:r>
+    </w:p>
+    <w:p>
+      <w:pPr>
+        <w:numPr>
+          <w:ilvl w:val="0"/>
+          <w:numId w:val="54"/>
+        </w:numPr>
+        <w:spacing w:before="100" w:beforeAutospacing="1" w:after="100" w:afterAutospacing="1"/>
+      </w:pPr>
+      <w:r>
+        <w:rPr>
+          <w:rStyle w:val="Strong"/>
+        </w:rPr>
+        <w:t>Key takeaway:</w:t>
+      </w:r>
+      <w:r>
+        <w:t xml:space="preserve"> Resource insufficiency appears operationally easier to identify and may be highly predictable.</w:t>
+      </w:r>
+    </w:p>
+    <w:p>
+      <w:pPr>
+        <w:spacing w:after="0"/>
+      </w:pPr>
+      <w:r>
+        <w:rPr>
+          <w:noProof/>
+        </w:rPr>
+        <w:pict w14:anchorId="492209B5">
+          <v:rect id="_x0000_i1040" alt="" style="width:468pt;height:.05pt;mso-width-percent:0;mso-height-percent:0;mso-width-percent:0;mso-height-percent:0" o:hralign="center" o:hrstd="t" o:hr="t" fillcolor="#a0a0a0" stroked="f"/>
+        </w:pict>
+      </w:r>
+    </w:p>
+    <w:p>
+      <w:pPr>
+        <w:pStyle w:val="Heading3"/>
+      </w:pPr>
+      <w:r>
+        <w:t xml:space="preserve">3. C2 (Coverage Overshooting) Occupies a Unique Distance Region </w:t>
+      </w:r>
+      <w:r>
+        <w:rPr>
+          <w:rFonts w:ascii="Apple Color Emoji" w:hAnsi="Apple Color Emoji" w:cs="Apple Color Emoji"/>
+        </w:rPr>
+        <w:t>⭐⭐⭐⭐</w:t>
+      </w:r>
+    </w:p>
+    <w:p>
+      <w:pPr>
+        <w:numPr>
+          <w:ilvl w:val="0"/>
+          <w:numId w:val="55"/>
+        </w:numPr>
+        <w:spacing w:before="100" w:beforeAutospacing="1" w:after="100" w:afterAutospacing="1"/>
+      </w:pPr>
+      <w:r>
+        <w:rPr>
+          <w:rStyle w:val="Strong"/>
+        </w:rPr>
+        <w:t>C2 scenarios consistently showed longer serving distances</w:t>
+      </w:r>
+      <w:r>
+        <w:t xml:space="preserve">, frequently exceeding </w:t>
+      </w:r>
+      <w:r>
+        <w:rPr>
+          <w:rStyle w:val="Strong"/>
+        </w:rPr>
+        <w:t>1 km</w:t>
+      </w:r>
+      <w:r>
+        <w:t>.</w:t>
+      </w:r>
+    </w:p>
+    <w:p>
+      <w:pPr>
+        <w:numPr>
+          <w:ilvl w:val="0"/>
+          <w:numId w:val="55"/>
+        </w:numPr>
+        <w:spacing w:before="100" w:beforeAutospacing="1" w:after="100" w:afterAutospacing="1"/>
+      </w:pPr>
+      <w:r>
+        <w:t xml:space="preserve">C2 occupied a visually distinct region in </w:t>
+      </w:r>
+      <w:r>
+        <w:rPr>
+          <w:rStyle w:val="Strong"/>
+        </w:rPr>
+        <w:t>Throughput vs Serving Distance</w:t>
+      </w:r>
+      <w:r>
+        <w:t xml:space="preserve"> plots.</w:t>
+      </w:r>
+    </w:p>
+    <w:p>
+      <w:pPr>
+        <w:numPr>
+          <w:ilvl w:val="0"/>
+          <w:numId w:val="55"/>
+        </w:numPr>
+        <w:spacing w:before="100" w:beforeAutospacing="1" w:after="100" w:afterAutospacing="1"/>
+      </w:pPr>
+      <w:r>
+        <w:t>Surprisingly, RSRP was not dramatically worse than expected, suggesting:</w:t>
+      </w:r>
+    </w:p>
+    <w:p>
+      <w:pPr>
+        <w:numPr>
+          <w:ilvl w:val="1"/>
+          <w:numId w:val="55"/>
+        </w:numPr>
+        <w:spacing w:before="100" w:beforeAutospacing="1" w:after="100" w:afterAutospacing="1"/>
+      </w:pPr>
+      <w:r>
+        <w:rPr>
+          <w:rStyle w:val="Strong"/>
+        </w:rPr>
+        <w:t>distance itself may matter more than raw signal strength</w:t>
+      </w:r>
+      <w:r>
+        <w:t>.</w:t>
+      </w:r>
+    </w:p>
+    <w:p>
+      <w:pPr>
+        <w:numPr>
+          <w:ilvl w:val="0"/>
+          <w:numId w:val="55"/>
+        </w:numPr>
+        <w:spacing w:before="100" w:beforeAutospacing="1" w:after="100" w:afterAutospacing="1"/>
+      </w:pPr>
+      <w:r>
+        <w:rPr>
+          <w:rStyle w:val="Strong"/>
+        </w:rPr>
+        <w:t>Key takeaway:</w:t>
+      </w:r>
+      <w:r>
+        <w:t xml:space="preserve"> Overshooting behavior can likely be detected through serving-distance features.</w:t>
+      </w:r>
+    </w:p>
+    <w:p>
+      <w:pPr>
+        <w:spacing w:after="0"/>
+      </w:pPr>
+      <w:r>
+        <w:rPr>
+          <w:noProof/>
+        </w:rPr>
+        <w:pict w14:anchorId="59C88307">
+          <v:rect id="_x0000_i1039" alt="" style="width:468pt;height:.05pt;mso-width-percent:0;mso-height-percent:0;mso-width-percent:0;mso-height-percent:0" o:hralign="center" o:hrstd="t" o:hr="t" fillcolor="#a0a0a0" stroked="f"/>
+        </w:pict>
+      </w:r>
+    </w:p>
+    <w:p>
+      <w:pPr>
+        <w:pStyle w:val="Heading3"/>
+      </w:pPr>
+      <w:r>
+        <w:t xml:space="preserve">4. PCA Shows Natural RCA Separation </w:t>
+      </w:r>
+      <w:r>
+        <w:rPr>
+          <w:rFonts w:ascii="Apple Color Emoji" w:hAnsi="Apple Color Emoji" w:cs="Apple Color Emoji"/>
+        </w:rPr>
+        <w:t>⭐⭐⭐⭐</w:t>
+      </w:r>
+    </w:p>
+    <w:p>
+      <w:pPr>
+        <w:numPr>
+          <w:ilvl w:val="0"/>
+          <w:numId w:val="56"/>
+        </w:numPr>
+        <w:spacing w:before="100" w:beforeAutospacing="1" w:after="100" w:afterAutospacing="1"/>
+      </w:pPr>
+      <w:r>
+        <w:t xml:space="preserve">PCA analysis revealed </w:t>
+      </w:r>
+      <w:r>
+        <w:rPr>
+          <w:rStyle w:val="Strong"/>
+        </w:rPr>
+        <w:t>partial natural clustering</w:t>
+      </w:r>
+      <w:r>
+        <w:t xml:space="preserve"> of RCA classes.</w:t>
+      </w:r>
+    </w:p>
+    <w:p>
+      <w:pPr>
+        <w:numPr>
+          <w:ilvl w:val="0"/>
+          <w:numId w:val="56"/>
+        </w:numPr>
+        <w:spacing w:before="100" w:beforeAutospacing="1" w:after="100" w:afterAutospacing="1"/>
+      </w:pPr>
+      <w:r>
+        <w:lastRenderedPageBreak/>
+        <w:t xml:space="preserve">Even though the first two components explained only </w:t>
+      </w:r>
+      <w:r>
+        <w:rPr>
+          <w:rStyle w:val="Strong"/>
+        </w:rPr>
+        <w:t>~33% of total variance</w:t>
+      </w:r>
+      <w:r>
+        <w:t>,:</w:t>
+      </w:r>
+    </w:p>
+    <w:p>
+      <w:pPr>
+        <w:numPr>
+          <w:ilvl w:val="1"/>
+          <w:numId w:val="56"/>
+        </w:numPr>
+        <w:spacing w:before="100" w:beforeAutospacing="1" w:after="100" w:afterAutospacing="1"/>
+      </w:pPr>
+      <w:r>
+        <w:rPr>
+          <w:rStyle w:val="Strong"/>
+        </w:rPr>
+        <w:t>C2 and C8 formed clearer clusters</w:t>
+      </w:r>
+    </w:p>
+    <w:p>
+      <w:pPr>
+        <w:numPr>
+          <w:ilvl w:val="1"/>
+          <w:numId w:val="56"/>
+        </w:numPr>
+        <w:spacing w:before="100" w:beforeAutospacing="1" w:after="100" w:afterAutospacing="1"/>
+      </w:pPr>
+      <w:r>
+        <w:t>other RCA categories showed partial overlap.</w:t>
+      </w:r>
+    </w:p>
+    <w:p>
+      <w:pPr>
+        <w:numPr>
+          <w:ilvl w:val="0"/>
+          <w:numId w:val="56"/>
+        </w:numPr>
+        <w:spacing w:before="100" w:beforeAutospacing="1" w:after="100" w:afterAutospacing="1"/>
+      </w:pPr>
+      <w:r>
+        <w:rPr>
+          <w:rStyle w:val="Strong"/>
+        </w:rPr>
+        <w:t>Key takeaway:</w:t>
+      </w:r>
+      <w:r>
+        <w:t xml:space="preserve"> RCA classes occupy identifiable regions in feature space, supporting the feasibility of ML-based classification.</w:t>
+      </w:r>
+    </w:p>
+    <w:p>
+      <w:pPr>
+        <w:spacing w:after="0"/>
+      </w:pPr>
+      <w:r>
+        <w:rPr>
+          <w:noProof/>
+        </w:rPr>
+        <w:pict w14:anchorId="1ECCC05C">
+          <v:rect id="_x0000_i1038" alt="" style="width:468pt;height:.05pt;mso-width-percent:0;mso-height-percent:0;mso-width-percent:0;mso-height-percent:0" o:hralign="center" o:hrstd="t" o:hr="t" fillcolor="#a0a0a0" stroked="f"/>
+        </w:pict>
+      </w:r>
+    </w:p>
+    <w:p>
+      <w:pPr>
+        <w:pStyle w:val="Heading3"/>
+      </w:pPr>
+      <w:r>
+        <w:t xml:space="preserve">5. Antenna Model Affects Throughput but Not RCA </w:t>
+      </w:r>
+      <w:r>
+        <w:rPr>
+          <w:rFonts w:ascii="Apple Color Emoji" w:hAnsi="Apple Color Emoji" w:cs="Apple Color Emoji"/>
+        </w:rPr>
+        <w:t>⭐⭐⭐</w:t>
+      </w:r>
+    </w:p>
+    <w:p>
+      <w:pPr>
+        <w:numPr>
+          <w:ilvl w:val="0"/>
+          <w:numId w:val="57"/>
+        </w:numPr>
+        <w:spacing w:before="100" w:beforeAutospacing="1" w:after="100" w:afterAutospacing="1"/>
+      </w:pPr>
+      <w:r>
+        <w:t xml:space="preserve">Antenna model showed </w:t>
+      </w:r>
+      <w:r>
+        <w:rPr>
+          <w:rStyle w:val="Strong"/>
+        </w:rPr>
+        <w:t>noticeable throughput differences</w:t>
+      </w:r>
+      <w:r>
+        <w:t>:</w:t>
+      </w:r>
+    </w:p>
+    <w:p>
+      <w:pPr>
+        <w:numPr>
+          <w:ilvl w:val="1"/>
+          <w:numId w:val="57"/>
+        </w:numPr>
+        <w:spacing w:before="100" w:beforeAutospacing="1" w:after="100" w:afterAutospacing="1"/>
+      </w:pPr>
+      <w:r>
+        <w:rPr>
+          <w:rStyle w:val="Strong"/>
+        </w:rPr>
+        <w:t>NR AAU 1 → highest throughput</w:t>
+      </w:r>
+    </w:p>
+    <w:p>
+      <w:pPr>
+        <w:numPr>
+          <w:ilvl w:val="1"/>
+          <w:numId w:val="57"/>
+        </w:numPr>
+        <w:spacing w:before="100" w:beforeAutospacing="1" w:after="100" w:afterAutospacing="1"/>
+      </w:pPr>
+      <w:r>
+        <w:rPr>
+          <w:rStyle w:val="Strong"/>
+        </w:rPr>
+        <w:t>NR AAU 3 → lowest throughput</w:t>
+      </w:r>
+    </w:p>
+    <w:p>
+      <w:pPr>
+        <w:numPr>
+          <w:ilvl w:val="0"/>
+          <w:numId w:val="57"/>
+        </w:numPr>
+        <w:spacing w:before="100" w:beforeAutospacing="1" w:after="100" w:afterAutospacing="1"/>
+      </w:pPr>
+      <w:r>
+        <w:t>Interestingly:</w:t>
+      </w:r>
+    </w:p>
+    <w:p>
+      <w:pPr>
+        <w:numPr>
+          <w:ilvl w:val="1"/>
+          <w:numId w:val="57"/>
+        </w:numPr>
+        <w:spacing w:before="100" w:beforeAutospacing="1" w:after="100" w:afterAutospacing="1"/>
+      </w:pPr>
+      <w:r>
+        <w:rPr>
+          <w:rStyle w:val="Strong"/>
+        </w:rPr>
+        <w:t>NR AAU 3 had the strongest SINR but lowest throughput efficiency</w:t>
+      </w:r>
+      <w:r>
+        <w:t>.</w:t>
+      </w:r>
+    </w:p>
+    <w:p>
+      <w:pPr>
+        <w:numPr>
+          <w:ilvl w:val="0"/>
+          <w:numId w:val="57"/>
+        </w:numPr>
+        <w:spacing w:before="100" w:beforeAutospacing="1" w:after="100" w:afterAutospacing="1"/>
+      </w:pPr>
+      <w:r>
+        <w:t>However, antenna model distribution across RCA categories remained nearly identical.</w:t>
+      </w:r>
+    </w:p>
+    <w:p>
+      <w:pPr>
+        <w:numPr>
+          <w:ilvl w:val="0"/>
+          <w:numId w:val="57"/>
+        </w:numPr>
+        <w:spacing w:before="100" w:beforeAutospacing="1" w:after="100" w:afterAutospacing="1"/>
+      </w:pPr>
+      <w:r>
+        <w:rPr>
+          <w:rStyle w:val="Strong"/>
+        </w:rPr>
+        <w:t>Key takeaway:</w:t>
+      </w:r>
+      <w:r>
+        <w:t xml:space="preserve"> Antenna model may influence throughput efficiency but does </w:t>
+      </w:r>
+      <w:r>
+        <w:rPr>
+          <w:rStyle w:val="Strong"/>
+        </w:rPr>
+        <w:t>not strongly explain root cause mechanisms</w:t>
+      </w:r>
+      <w:r>
+        <w:t>.</w:t>
+      </w:r>
+    </w:p>
+    <w:p>
+      <w:r>
+        <w:br w:type="page"/>
+      </w:r>
+    </w:p>
+    <w:p>
+      <w:pPr>
+        <w:pStyle w:val="Heading2"/>
+      </w:pPr>
+      <w:r>
+        <w:lastRenderedPageBreak/>
+        <w:t>Feature Engineering Summary and RCA-Relevant Features</w:t>
+      </w:r>
+    </w:p>
+    <w:p>
+      <w:pPr>
+        <w:pStyle w:val="NormalWeb"/>
+      </w:pPr>
+      <w:r>
+        <w:t xml:space="preserve">Rather than relying solely on raw telecom KPIs, additional </w:t>
+      </w:r>
+      <w:r>
+        <w:rPr>
+          <w:rStyle w:val="Strong"/>
+        </w:rPr>
+        <w:t>scenario-level engineered features</w:t>
+      </w:r>
+      <w:r>
+        <w:t xml:space="preserve"> were created to better capture the behavioral patterns associated with different RCA categories. Since RCA mechanisms are often driven by combinations of radio conditions, mobility, interference, and resource allocation behaviors, feature engineering focused on transforming raw time-series measurements into interpretable telecom indicators.</w:t>
+      </w:r>
+    </w:p>
+    <w:p>
+      <w:pPr>
+        <w:pStyle w:val="Heading3"/>
+      </w:pPr>
+      <w:r>
+        <w:t>Throughput Behavior Features</w:t>
+      </w:r>
+    </w:p>
+    <w:p>
+      <w:pPr>
+        <w:pStyle w:val="NormalWeb"/>
+      </w:pPr>
+      <w:r>
+        <w:t>These features summarized throughput degradation patterns and helped distinguish severe versus mild degradation mechanisms.</w:t>
+      </w:r>
+    </w:p>
+    <w:p>
+      <w:pPr>
+        <w:pStyle w:val="NormalWeb"/>
+        <w:numPr>
+          <w:ilvl w:val="0"/>
+          <w:numId w:val="58"/>
+        </w:numPr>
+      </w:pPr>
+      <w:r>
+        <w:rPr>
+          <w:rStyle w:val="Strong"/>
+        </w:rPr>
+        <w:t>avg_throughput</w:t>
+      </w:r>
+      <w:r>
+        <w:t xml:space="preserve"> → average throughput across the scenario</w:t>
+      </w:r>
+    </w:p>
+    <w:p>
+      <w:pPr>
+        <w:pStyle w:val="NormalWeb"/>
+        <w:numPr>
+          <w:ilvl w:val="0"/>
+          <w:numId w:val="58"/>
+        </w:numPr>
+      </w:pPr>
+      <w:r>
+        <w:rPr>
+          <w:rStyle w:val="Strong"/>
+        </w:rPr>
+        <w:t>min_throughput</w:t>
+      </w:r>
+      <w:r>
+        <w:t xml:space="preserve"> → worst-case throughput condition</w:t>
+      </w:r>
+    </w:p>
+    <w:p>
+      <w:pPr>
+        <w:pStyle w:val="NormalWeb"/>
+        <w:numPr>
+          <w:ilvl w:val="0"/>
+          <w:numId w:val="58"/>
+        </w:numPr>
+      </w:pPr>
+      <w:r>
+        <w:rPr>
+          <w:rStyle w:val="Strong"/>
+        </w:rPr>
+        <w:t>std_throughput</w:t>
+      </w:r>
+      <w:r>
+        <w:t xml:space="preserve"> → throughput instability/variation</w:t>
+      </w:r>
+    </w:p>
+    <w:p>
+      <w:pPr>
+        <w:pStyle w:val="NormalWeb"/>
+        <w:numPr>
+          <w:ilvl w:val="0"/>
+          <w:numId w:val="58"/>
+        </w:numPr>
+      </w:pPr>
+      <w:r>
+        <w:rPr>
+          <w:rStyle w:val="Strong"/>
+        </w:rPr>
+        <w:t>low_tp_ratio</w:t>
+      </w:r>
+      <w:r>
+        <w:t xml:space="preserve"> → percentage of time throughput remained below threshold</w:t>
+      </w:r>
+    </w:p>
+    <w:p>
+      <w:pPr>
+        <w:pStyle w:val="NormalWeb"/>
+        <w:numPr>
+          <w:ilvl w:val="0"/>
+          <w:numId w:val="58"/>
+        </w:numPr>
+      </w:pPr>
+      <w:r>
+        <w:rPr>
+          <w:rStyle w:val="Strong"/>
+        </w:rPr>
+        <w:t>avg_throughput_low_tp</w:t>
+      </w:r>
+      <w:r>
+        <w:t xml:space="preserve"> → throughput during degraded periods</w:t>
+      </w:r>
+    </w:p>
+    <w:p>
+      <w:pPr>
+        <w:pStyle w:val="NormalWeb"/>
+        <w:numPr>
+          <w:ilvl w:val="0"/>
+          <w:numId w:val="58"/>
+        </w:numPr>
+      </w:pPr>
+      <w:r>
+        <w:rPr>
+          <w:rStyle w:val="Strong"/>
+        </w:rPr>
+        <w:t>consecutive_low_tp_max</w:t>
+      </w:r>
+      <w:r>
+        <w:t xml:space="preserve"> → longest continuous degradation duration</w:t>
+      </w:r>
+    </w:p>
+    <w:p>
+      <w:pPr>
+        <w:pStyle w:val="NormalWeb"/>
+      </w:pPr>
+      <w:r>
+        <w:rPr>
+          <w:rStyle w:val="Strong"/>
+        </w:rPr>
+        <w:t>Helped identify:</w:t>
+      </w:r>
+    </w:p>
+    <w:p>
+      <w:pPr>
+        <w:pStyle w:val="NormalWeb"/>
+        <w:numPr>
+          <w:ilvl w:val="0"/>
+          <w:numId w:val="59"/>
+        </w:numPr>
+      </w:pPr>
+      <w:r>
+        <w:rPr>
+          <w:rStyle w:val="Strong"/>
+        </w:rPr>
+        <w:t>C3:</w:t>
+      </w:r>
+      <w:r>
+        <w:t xml:space="preserve"> stable/high throughput despite neighboring-cell issue</w:t>
+      </w:r>
+    </w:p>
+    <w:p>
+      <w:pPr>
+        <w:pStyle w:val="NormalWeb"/>
+        <w:numPr>
+          <w:ilvl w:val="0"/>
+          <w:numId w:val="59"/>
+        </w:numPr>
+      </w:pPr>
+      <w:r>
+        <w:rPr>
+          <w:rStyle w:val="Strong"/>
+        </w:rPr>
+        <w:t>C8:</w:t>
+      </w:r>
+      <w:r>
+        <w:t xml:space="preserve"> consistently degraded throughput behavior</w:t>
+      </w:r>
+    </w:p>
+    <w:p>
+      <w:r>
+        <w:rPr>
+          <w:noProof/>
+        </w:rPr>
+        <w:pict w14:anchorId="3F9027A0">
+          <v:rect id="_x0000_i1037" alt="" style="width:468pt;height:.05pt;mso-width-percent:0;mso-height-percent:0;mso-width-percent:0;mso-height-percent:0" o:hralign="center" o:hrstd="t" o:hr="t" fillcolor="#a0a0a0" stroked="f"/>
+        </w:pict>
+      </w:r>
+    </w:p>
+    <w:p>
+      <w:pPr>
+        <w:pStyle w:val="Heading3"/>
+      </w:pPr>
+      <w:r>
+        <w:t>Mobility &amp; Handover Features</w:t>
+      </w:r>
+    </w:p>
+    <w:p>
+      <w:pPr>
+        <w:pStyle w:val="NormalWeb"/>
+      </w:pPr>
+      <w:r>
+        <w:t>Mobility-related features were engineered to quantify serving-cell instability and movement behavior.</w:t>
+      </w:r>
+    </w:p>
+    <w:p>
+      <w:pPr>
+        <w:pStyle w:val="NormalWeb"/>
+        <w:numPr>
+          <w:ilvl w:val="0"/>
+          <w:numId w:val="60"/>
+        </w:numPr>
+      </w:pPr>
+      <w:r>
+        <w:rPr>
+          <w:rStyle w:val="Strong"/>
+        </w:rPr>
+        <w:t>handover_count</w:t>
+      </w:r>
+      <w:r>
+        <w:t xml:space="preserve"> → number of serving-cell changes</w:t>
+      </w:r>
+    </w:p>
+    <w:p>
+      <w:pPr>
+        <w:pStyle w:val="NormalWeb"/>
+        <w:numPr>
+          <w:ilvl w:val="0"/>
+          <w:numId w:val="60"/>
+        </w:numPr>
+      </w:pPr>
+      <w:r>
+        <w:rPr>
+          <w:rStyle w:val="Strong"/>
+        </w:rPr>
+        <w:t>handover_rate</w:t>
+      </w:r>
+      <w:r>
+        <w:t xml:space="preserve"> → handovers normalized by scenario duration</w:t>
+      </w:r>
+    </w:p>
+    <w:p>
+      <w:pPr>
+        <w:pStyle w:val="NormalWeb"/>
+        <w:numPr>
+          <w:ilvl w:val="0"/>
+          <w:numId w:val="60"/>
+        </w:numPr>
+      </w:pPr>
+      <w:r>
+        <w:rPr>
+          <w:rStyle w:val="Strong"/>
+        </w:rPr>
+        <w:t>num_unique_serving_pci</w:t>
+      </w:r>
+      <w:r>
+        <w:t xml:space="preserve"> → number of serving cells observed</w:t>
+      </w:r>
+    </w:p>
+    <w:p>
+      <w:pPr>
+        <w:pStyle w:val="NormalWeb"/>
+        <w:numPr>
+          <w:ilvl w:val="0"/>
+          <w:numId w:val="60"/>
+        </w:numPr>
+      </w:pPr>
+      <w:r>
+        <w:rPr>
+          <w:rStyle w:val="Strong"/>
+        </w:rPr>
+        <w:t>pct_speed_above_40</w:t>
+      </w:r>
+      <w:r>
+        <w:t xml:space="preserve"> → proportion of time vehicle exceeded 40 km/h</w:t>
+      </w:r>
+    </w:p>
+    <w:p>
+      <w:pPr>
+        <w:pStyle w:val="NormalWeb"/>
+      </w:pPr>
+      <w:r>
+        <w:rPr>
+          <w:rStyle w:val="Strong"/>
+        </w:rPr>
+        <w:t>Helped identify:</w:t>
+      </w:r>
+    </w:p>
+    <w:p>
+      <w:pPr>
+        <w:pStyle w:val="NormalWeb"/>
+        <w:numPr>
+          <w:ilvl w:val="0"/>
+          <w:numId w:val="61"/>
+        </w:numPr>
+      </w:pPr>
+      <w:r>
+        <w:rPr>
+          <w:rStyle w:val="Strong"/>
+        </w:rPr>
+        <w:t>C5:</w:t>
+      </w:r>
+      <w:r>
+        <w:t xml:space="preserve"> excessive handovers and serving-cell instability</w:t>
+      </w:r>
+    </w:p>
+    <w:p>
+      <w:pPr>
+        <w:pStyle w:val="NormalWeb"/>
+        <w:numPr>
+          <w:ilvl w:val="0"/>
+          <w:numId w:val="61"/>
+        </w:numPr>
+      </w:pPr>
+      <w:r>
+        <w:rPr>
+          <w:rStyle w:val="Strong"/>
+        </w:rPr>
+        <w:t>C7:</w:t>
+      </w:r>
+      <w:r>
+        <w:t xml:space="preserve"> mobility-related degradation at higher speeds</w:t>
+      </w:r>
+    </w:p>
+    <w:p>
+      <w:r>
+        <w:rPr>
+          <w:noProof/>
+        </w:rPr>
+        <w:pict w14:anchorId="44D929D7">
+          <v:rect id="_x0000_i1036" alt="" style="width:468pt;height:.05pt;mso-width-percent:0;mso-height-percent:0;mso-width-percent:0;mso-height-percent:0" o:hralign="center" o:hrstd="t" o:hr="t" fillcolor="#a0a0a0" stroked="f"/>
+        </w:pict>
+      </w:r>
+    </w:p>
+    <w:p>
+      <w:pPr>
+        <w:pStyle w:val="Heading3"/>
+      </w:pPr>
+      <w:r>
+        <w:lastRenderedPageBreak/>
+        <w:t>Signal Quality Features (RSRP / SINR)</w:t>
+      </w:r>
+    </w:p>
+    <w:p>
+      <w:pPr>
+        <w:pStyle w:val="NormalWeb"/>
+      </w:pPr>
+      <w:r>
+        <w:t>RF signal features summarized signal strength and cleanliness.</w:t>
+      </w:r>
+    </w:p>
+    <w:p>
+      <w:pPr>
+        <w:pStyle w:val="NormalWeb"/>
+        <w:numPr>
+          <w:ilvl w:val="0"/>
+          <w:numId w:val="62"/>
+        </w:numPr>
+      </w:pPr>
+      <w:r>
+        <w:rPr>
+          <w:rStyle w:val="Strong"/>
+        </w:rPr>
+        <w:t>avg_rsrp / min_rsrp</w:t>
+      </w:r>
+      <w:r>
+        <w:t xml:space="preserve"> → serving signal strength</w:t>
+      </w:r>
+    </w:p>
+    <w:p>
+      <w:pPr>
+        <w:pStyle w:val="NormalWeb"/>
+        <w:numPr>
+          <w:ilvl w:val="0"/>
+          <w:numId w:val="62"/>
+        </w:numPr>
+      </w:pPr>
+      <w:r>
+        <w:rPr>
+          <w:rStyle w:val="Strong"/>
+        </w:rPr>
+        <w:t>avg_sinr / min_sinr</w:t>
+      </w:r>
+      <w:r>
+        <w:t xml:space="preserve"> → interference and signal quality</w:t>
+      </w:r>
+    </w:p>
+    <w:p>
+      <w:pPr>
+        <w:pStyle w:val="NormalWeb"/>
+        <w:numPr>
+          <w:ilvl w:val="0"/>
+          <w:numId w:val="62"/>
+        </w:numPr>
+      </w:pPr>
+      <w:r>
+        <w:rPr>
+          <w:rStyle w:val="Strong"/>
+        </w:rPr>
+        <w:t>std_sinr</w:t>
+      </w:r>
+      <w:r>
+        <w:t xml:space="preserve"> → signal quality instability</w:t>
+      </w:r>
+    </w:p>
+    <w:p>
+      <w:pPr>
+        <w:pStyle w:val="NormalWeb"/>
+        <w:numPr>
+          <w:ilvl w:val="0"/>
+          <w:numId w:val="62"/>
+        </w:numPr>
+      </w:pPr>
+      <w:r>
+        <w:rPr>
+          <w:rStyle w:val="Strong"/>
+        </w:rPr>
+        <w:t>pct_sinr_below_5</w:t>
+      </w:r>
+      <w:r>
+        <w:t xml:space="preserve"> → frequency of poor SINR conditions</w:t>
+      </w:r>
+    </w:p>
+    <w:p>
+      <w:pPr>
+        <w:pStyle w:val="NormalWeb"/>
+      </w:pPr>
+      <w:r>
+        <w:rPr>
+          <w:rStyle w:val="Strong"/>
+        </w:rPr>
+        <w:t>Helped identify:</w:t>
+      </w:r>
+    </w:p>
+    <w:p>
+      <w:pPr>
+        <w:pStyle w:val="NormalWeb"/>
+        <w:numPr>
+          <w:ilvl w:val="0"/>
+          <w:numId w:val="63"/>
+        </w:numPr>
+      </w:pPr>
+      <w:r>
+        <w:t>interference-related RCA behavior</w:t>
+      </w:r>
+    </w:p>
+    <w:p>
+      <w:pPr>
+        <w:pStyle w:val="NormalWeb"/>
+        <w:numPr>
+          <w:ilvl w:val="0"/>
+          <w:numId w:val="63"/>
+        </w:numPr>
+      </w:pPr>
+      <w:r>
+        <w:t>differences in RF environments across scenarios</w:t>
+      </w:r>
+    </w:p>
+    <w:p>
+      <w:r>
+        <w:rPr>
+          <w:noProof/>
+        </w:rPr>
+        <w:pict w14:anchorId="7FE261B9">
+          <v:rect id="_x0000_i1035" alt="" style="width:468pt;height:.05pt;mso-width-percent:0;mso-height-percent:0;mso-width-percent:0;mso-height-percent:0" o:hralign="center" o:hrstd="t" o:hr="t" fillcolor="#a0a0a0" stroked="f"/>
+        </w:pict>
+      </w:r>
+    </w:p>
+    <w:p>
+      <w:pPr>
+        <w:pStyle w:val="Heading3"/>
+      </w:pPr>
+      <w:r>
+        <w:t>Resource Allocation Features (RB)</w:t>
+      </w:r>
+    </w:p>
+    <w:p>
+      <w:pPr>
+        <w:pStyle w:val="NormalWeb"/>
+      </w:pPr>
+      <w:r>
+        <w:t>Radio resource block features captured scheduling and resource sufficiency behavior.</w:t>
+      </w:r>
+    </w:p>
+    <w:p>
+      <w:pPr>
+        <w:pStyle w:val="NormalWeb"/>
+        <w:numPr>
+          <w:ilvl w:val="0"/>
+          <w:numId w:val="64"/>
+        </w:numPr>
+      </w:pPr>
+      <w:r>
+        <w:rPr>
+          <w:rStyle w:val="Strong"/>
+        </w:rPr>
+        <w:t>avg_rb / min_rb</w:t>
+      </w:r>
+      <w:r>
+        <w:t xml:space="preserve"> → RB allocation levels</w:t>
+      </w:r>
+    </w:p>
+    <w:p>
+      <w:pPr>
+        <w:pStyle w:val="NormalWeb"/>
+        <w:numPr>
+          <w:ilvl w:val="0"/>
+          <w:numId w:val="64"/>
+        </w:numPr>
+      </w:pPr>
+      <w:r>
+        <w:rPr>
+          <w:rStyle w:val="Strong"/>
+        </w:rPr>
+        <w:t>avg_rb_low_tp</w:t>
+      </w:r>
+      <w:r>
+        <w:t xml:space="preserve"> → RB allocation during degradation</w:t>
+      </w:r>
+    </w:p>
+    <w:p>
+      <w:pPr>
+        <w:pStyle w:val="NormalWeb"/>
+        <w:numPr>
+          <w:ilvl w:val="0"/>
+          <w:numId w:val="64"/>
+        </w:numPr>
+      </w:pPr>
+      <w:r>
+        <w:rPr>
+          <w:rStyle w:val="Strong"/>
+        </w:rPr>
+        <w:t>pct_rb_below_160</w:t>
+      </w:r>
+      <w:r>
+        <w:t xml:space="preserve"> → proportion of time with insufficient RB allocation</w:t>
+      </w:r>
+    </w:p>
+    <w:p>
+      <w:pPr>
+        <w:pStyle w:val="NormalWeb"/>
+      </w:pPr>
+      <w:r>
+        <w:rPr>
+          <w:rStyle w:val="Strong"/>
+        </w:rPr>
+        <w:t>Helped identify:</w:t>
+      </w:r>
+    </w:p>
+    <w:p>
+      <w:pPr>
+        <w:pStyle w:val="NormalWeb"/>
+        <w:numPr>
+          <w:ilvl w:val="0"/>
+          <w:numId w:val="65"/>
+        </w:numPr>
+      </w:pPr>
+      <w:r>
+        <w:rPr>
+          <w:rStyle w:val="Strong"/>
+        </w:rPr>
+        <w:t>C8:</w:t>
+      </w:r>
+      <w:r>
+        <w:t xml:space="preserve"> resource insufficiency (strongest feature group)</w:t>
+      </w:r>
+    </w:p>
+    <w:p>
+      <w:r>
+        <w:rPr>
+          <w:noProof/>
+        </w:rPr>
+        <w:pict w14:anchorId="6E3F9989">
           <v:rect id="_x0000_i1034" alt="" style="width:468pt;height:.05pt;mso-width-percent:0;mso-height-percent:0;mso-width-percent:0;mso-height-percent:0" o:hralign="center" o:hrstd="t" o:hr="t" fillcolor="#a0a0a0" stroked="f"/>
         </w:pict>
       </w:r>
@@ -2846,129 +3950,142 @@
         <w:pStyle w:val="Heading3"/>
       </w:pPr>
       <w:r>
-        <w:t xml:space="preserve">2. C8 (Resource Insufficiency) Forms a Distinct Cluster </w:t>
-      </w:r>
-      <w:r>
-        <w:rPr>
-          <w:rFonts w:ascii="Apple Color Emoji" w:hAnsi="Apple Color Emoji" w:cs="Apple Color Emoji"/>
-        </w:rPr>
-        <w:t>⭐⭐⭐⭐⭐</w:t>
-      </w:r>
-    </w:p>
-    <w:p>
-      <w:pPr>
-        <w:numPr>
-          <w:ilvl w:val="0"/>
-          <w:numId w:val="54"/>
-        </w:numPr>
-        <w:spacing w:before="100" w:beforeAutospacing="1" w:after="100" w:afterAutospacing="1"/>
+        <w:t>Neighbor &amp; Overlap Features</w:t>
+      </w:r>
+    </w:p>
+    <w:p>
+      <w:pPr>
+        <w:pStyle w:val="NormalWeb"/>
+      </w:pPr>
+      <w:r>
+        <w:t>Neighbor-cell features quantified competition between serving and neighboring cells.</w:t>
+      </w:r>
+    </w:p>
+    <w:p>
+      <w:pPr>
+        <w:pStyle w:val="NormalWeb"/>
+        <w:numPr>
+          <w:ilvl w:val="0"/>
+          <w:numId w:val="66"/>
+        </w:numPr>
       </w:pPr>
       <w:r>
         <w:rPr>
           <w:rStyle w:val="Strong"/>
         </w:rPr>
-        <w:t>C8 clearly separated from other RCA categories</w:t>
-      </w:r>
-      <w:r>
-        <w:t xml:space="preserve"> in RB-related analysis.</w:t>
-      </w:r>
-    </w:p>
-    <w:p>
-      <w:pPr>
-        <w:numPr>
-          <w:ilvl w:val="0"/>
-          <w:numId w:val="54"/>
-        </w:numPr>
-        <w:spacing w:before="100" w:beforeAutospacing="1" w:after="100" w:afterAutospacing="1"/>
-      </w:pPr>
-      <w:r>
-        <w:t>Observed:</w:t>
-      </w:r>
-    </w:p>
-    <w:p>
-      <w:pPr>
-        <w:numPr>
-          <w:ilvl w:val="1"/>
-          <w:numId w:val="54"/>
-        </w:numPr>
-        <w:spacing w:before="100" w:beforeAutospacing="1" w:after="100" w:afterAutospacing="1"/>
-      </w:pPr>
-      <w:r>
-        <w:t>lower average RB allocation</w:t>
-      </w:r>
-    </w:p>
-    <w:p>
-      <w:pPr>
-        <w:numPr>
-          <w:ilvl w:val="1"/>
-          <w:numId w:val="54"/>
-        </w:numPr>
-        <w:spacing w:before="100" w:beforeAutospacing="1" w:after="100" w:afterAutospacing="1"/>
-      </w:pPr>
-      <w:r>
-        <w:t>higher percentage of time with RB &lt; 160</w:t>
-      </w:r>
-    </w:p>
-    <w:p>
-      <w:pPr>
-        <w:numPr>
-          <w:ilvl w:val="1"/>
-          <w:numId w:val="54"/>
-        </w:numPr>
-        <w:spacing w:before="100" w:beforeAutospacing="1" w:after="100" w:afterAutospacing="1"/>
-      </w:pPr>
-      <w:r>
-        <w:t>lower RB allocation during low-throughput periods</w:t>
-      </w:r>
-    </w:p>
-    <w:p>
-      <w:pPr>
-        <w:numPr>
-          <w:ilvl w:val="0"/>
-          <w:numId w:val="54"/>
-        </w:numPr>
-        <w:spacing w:before="100" w:beforeAutospacing="1" w:after="100" w:afterAutospacing="1"/>
-      </w:pPr>
-      <w:r>
-        <w:t xml:space="preserve">C8 formed a visually distinct cluster in </w:t>
-      </w:r>
+        <w:t>avg_neighbor_advantage</w:t>
+      </w:r>
+      <w:r>
+        <w:t xml:space="preserve"> → strongest neighbor signal relative to serving signal</w:t>
+      </w:r>
+    </w:p>
+    <w:p>
+      <w:pPr>
+        <w:pStyle w:val="NormalWeb"/>
+        <w:numPr>
+          <w:ilvl w:val="0"/>
+          <w:numId w:val="66"/>
+        </w:numPr>
+      </w:pPr>
       <w:r>
         <w:rPr>
           <w:rStyle w:val="Strong"/>
         </w:rPr>
-        <w:t>Throughput vs RB</w:t>
-      </w:r>
-      <w:r>
-        <w:t xml:space="preserve"> plots.</w:t>
-      </w:r>
-    </w:p>
-    <w:p>
-      <w:pPr>
-        <w:numPr>
-          <w:ilvl w:val="0"/>
-          <w:numId w:val="54"/>
-        </w:numPr>
-        <w:spacing w:before="100" w:beforeAutospacing="1" w:after="100" w:afterAutospacing="1"/>
+        <w:t>neighbor_stronger_ratio</w:t>
+      </w:r>
+      <w:r>
+        <w:t xml:space="preserve"> → frequency neighbors outperformed serving signal</w:t>
+      </w:r>
+    </w:p>
+    <w:p>
+      <w:pPr>
+        <w:pStyle w:val="NormalWeb"/>
+        <w:numPr>
+          <w:ilvl w:val="0"/>
+          <w:numId w:val="66"/>
+        </w:numPr>
       </w:pPr>
       <w:r>
         <w:rPr>
           <w:rStyle w:val="Strong"/>
         </w:rPr>
-        <w:t>Key takeaway:</w:t>
-      </w:r>
-      <w:r>
-        <w:t xml:space="preserve"> Resource insufficiency appears operationally easier to identify and may be highly predictable.</w:t>
-      </w:r>
-    </w:p>
-    <w:p>
-      <w:pPr>
-        <w:spacing w:after="0"/>
-      </w:pPr>
+        <w:t>avg_close_neighbor_count</w:t>
+      </w:r>
+      <w:r>
+        <w:t xml:space="preserve"> → nearby competing neighbors</w:t>
+      </w:r>
+    </w:p>
+    <w:p>
+      <w:pPr>
+        <w:pStyle w:val="NormalWeb"/>
+        <w:numPr>
+          <w:ilvl w:val="0"/>
+          <w:numId w:val="66"/>
+        </w:numPr>
+      </w:pPr>
+      <w:r>
+        <w:rPr>
+          <w:rStyle w:val="Strong"/>
+        </w:rPr>
+        <w:t>overlap_ratio</w:t>
+      </w:r>
+      <w:r>
+        <w:t xml:space="preserve"> → overlapping coverage severity</w:t>
+      </w:r>
+    </w:p>
+    <w:p>
+      <w:pPr>
+        <w:pStyle w:val="NormalWeb"/>
+      </w:pPr>
+      <w:r>
+        <w:rPr>
+          <w:rStyle w:val="Strong"/>
+        </w:rPr>
+        <w:t>Helped identify:</w:t>
+      </w:r>
+    </w:p>
+    <w:p>
+      <w:pPr>
+        <w:pStyle w:val="NormalWeb"/>
+        <w:numPr>
+          <w:ilvl w:val="0"/>
+          <w:numId w:val="67"/>
+        </w:numPr>
+      </w:pPr>
+      <w:r>
+        <w:rPr>
+          <w:rStyle w:val="Strong"/>
+        </w:rPr>
+        <w:t>C4:</w:t>
+      </w:r>
+      <w:r>
+        <w:t xml:space="preserve"> overlapping coverage/interference</w:t>
+      </w:r>
+    </w:p>
+    <w:p>
+      <w:pPr>
+        <w:pStyle w:val="NormalWeb"/>
+        <w:numPr>
+          <w:ilvl w:val="0"/>
+          <w:numId w:val="67"/>
+        </w:numPr>
+      </w:pPr>
+      <w:r>
+        <w:rPr>
+          <w:rStyle w:val="Strong"/>
+        </w:rPr>
+        <w:t>C3:</w:t>
+      </w:r>
+      <w:r>
+        <w:t xml:space="preserve"> competitive neighboring-cell environment</w:t>
+      </w:r>
+    </w:p>
+    <w:p>
       <w:r>
         <w:rPr>
           <w:noProof/>
         </w:rPr>
-        <w:pict w14:anchorId="6897DAA1">
+        <w:pict w14:anchorId="1790C91F">
           <v:rect id="_x0000_i1033" alt="" style="width:468pt;height:.05pt;mso-width-percent:0;mso-height-percent:0;mso-width-percent:0;mso-height-percent:0" o:hralign="center" o:hrstd="t" o:hr="t" fillcolor="#a0a0a0" stroked="f"/>
         </w:pict>
       </w:r>
@@ -2978,1123 +4095,6 @@
         <w:pStyle w:val="Heading3"/>
       </w:pPr>
       <w:r>
-        <w:t xml:space="preserve">3. C2 (Coverage Overshooting) Occupies a Unique Distance Region </w:t>
-      </w:r>
-      <w:r>
-        <w:rPr>
-          <w:rFonts w:ascii="Apple Color Emoji" w:hAnsi="Apple Color Emoji" w:cs="Apple Color Emoji"/>
-        </w:rPr>
-        <w:t>⭐⭐⭐⭐</w:t>
-      </w:r>
-    </w:p>
-    <w:p>
-      <w:pPr>
-        <w:numPr>
-          <w:ilvl w:val="0"/>
-          <w:numId w:val="55"/>
-        </w:numPr>
-        <w:spacing w:before="100" w:beforeAutospacing="1" w:after="100" w:afterAutospacing="1"/>
-      </w:pPr>
-      <w:r>
-        <w:rPr>
-          <w:rStyle w:val="Strong"/>
-        </w:rPr>
-        <w:t>C2 scenarios consistently showed longer serving distances</w:t>
-      </w:r>
-      <w:r>
-        <w:t xml:space="preserve">, frequently exceeding </w:t>
-      </w:r>
-      <w:r>
-        <w:rPr>
-          <w:rStyle w:val="Strong"/>
-        </w:rPr>
-        <w:t>1 km</w:t>
-      </w:r>
-      <w:r>
-        <w:t>.</w:t>
-      </w:r>
-    </w:p>
-    <w:p>
-      <w:pPr>
-        <w:numPr>
-          <w:ilvl w:val="0"/>
-          <w:numId w:val="55"/>
-        </w:numPr>
-        <w:spacing w:before="100" w:beforeAutospacing="1" w:after="100" w:afterAutospacing="1"/>
-      </w:pPr>
-      <w:r>
-        <w:t xml:space="preserve">C2 occupied a visually distinct region in </w:t>
-      </w:r>
-      <w:r>
-        <w:rPr>
-          <w:rStyle w:val="Strong"/>
-        </w:rPr>
-        <w:t>Throughput vs Serving Distance</w:t>
-      </w:r>
-      <w:r>
-        <w:t xml:space="preserve"> plots.</w:t>
-      </w:r>
-    </w:p>
-    <w:p>
-      <w:pPr>
-        <w:numPr>
-          <w:ilvl w:val="0"/>
-          <w:numId w:val="55"/>
-        </w:numPr>
-        <w:spacing w:before="100" w:beforeAutospacing="1" w:after="100" w:afterAutospacing="1"/>
-      </w:pPr>
-      <w:r>
-        <w:t>Surprisingly, RSRP was not dramatically worse than expected, suggesting:</w:t>
-      </w:r>
-    </w:p>
-    <w:p>
-      <w:pPr>
-        <w:numPr>
-          <w:ilvl w:val="1"/>
-          <w:numId w:val="55"/>
-        </w:numPr>
-        <w:spacing w:before="100" w:beforeAutospacing="1" w:after="100" w:afterAutospacing="1"/>
-      </w:pPr>
-      <w:r>
-        <w:rPr>
-          <w:rStyle w:val="Strong"/>
-        </w:rPr>
-        <w:t>distance itself may matter more than raw signal strength</w:t>
-      </w:r>
-      <w:r>
-        <w:t>.</w:t>
-      </w:r>
-    </w:p>
-    <w:p>
-      <w:pPr>
-        <w:numPr>
-          <w:ilvl w:val="0"/>
-          <w:numId w:val="55"/>
-        </w:numPr>
-        <w:spacing w:before="100" w:beforeAutospacing="1" w:after="100" w:afterAutospacing="1"/>
-      </w:pPr>
-      <w:r>
-        <w:rPr>
-          <w:rStyle w:val="Strong"/>
-        </w:rPr>
-        <w:t>Key takeaway:</w:t>
-      </w:r>
-      <w:r>
-        <w:t xml:space="preserve"> Overshooting behavior can likely be detected through serving-distance features.</w:t>
-      </w:r>
-    </w:p>
-    <w:p>
-      <w:pPr>
-        <w:spacing w:after="0"/>
-      </w:pPr>
-      <w:r>
-        <w:rPr>
-          <w:noProof/>
-        </w:rPr>
-        <w:pict w14:anchorId="5A1B1529">
-          <v:rect id="_x0000_i1032" alt="" style="width:468pt;height:.05pt;mso-width-percent:0;mso-height-percent:0;mso-width-percent:0;mso-height-percent:0" o:hralign="center" o:hrstd="t" o:hr="t" fillcolor="#a0a0a0" stroked="f"/>
-        </w:pict>
-      </w:r>
-    </w:p>
-    <w:p>
-      <w:pPr>
-        <w:pStyle w:val="Heading3"/>
-      </w:pPr>
-      <w:r>
-        <w:t xml:space="preserve">4. PCA Shows Natural RCA Separation </w:t>
-      </w:r>
-      <w:r>
-        <w:rPr>
-          <w:rFonts w:ascii="Apple Color Emoji" w:hAnsi="Apple Color Emoji" w:cs="Apple Color Emoji"/>
-        </w:rPr>
-        <w:t>⭐⭐⭐⭐</w:t>
-      </w:r>
-    </w:p>
-    <w:p>
-      <w:pPr>
-        <w:numPr>
-          <w:ilvl w:val="0"/>
-          <w:numId w:val="56"/>
-        </w:numPr>
-        <w:spacing w:before="100" w:beforeAutospacing="1" w:after="100" w:afterAutospacing="1"/>
-      </w:pPr>
-      <w:r>
-        <w:t xml:space="preserve">PCA analysis revealed </w:t>
-      </w:r>
-      <w:r>
-        <w:rPr>
-          <w:rStyle w:val="Strong"/>
-        </w:rPr>
-        <w:t>partial natural clustering</w:t>
-      </w:r>
-      <w:r>
-        <w:t xml:space="preserve"> of RCA classes.</w:t>
-      </w:r>
-    </w:p>
-    <w:p>
-      <w:pPr>
-        <w:numPr>
-          <w:ilvl w:val="0"/>
-          <w:numId w:val="56"/>
-        </w:numPr>
-        <w:spacing w:before="100" w:beforeAutospacing="1" w:after="100" w:afterAutospacing="1"/>
-      </w:pPr>
-      <w:r>
-        <w:lastRenderedPageBreak/>
-        <w:t xml:space="preserve">Even though the first two components explained only </w:t>
-      </w:r>
-      <w:r>
-        <w:rPr>
-          <w:rStyle w:val="Strong"/>
-        </w:rPr>
-        <w:t>~33% of total variance</w:t>
-      </w:r>
-      <w:r>
-        <w:t>,:</w:t>
-      </w:r>
-    </w:p>
-    <w:p>
-      <w:pPr>
-        <w:numPr>
-          <w:ilvl w:val="1"/>
-          <w:numId w:val="56"/>
-        </w:numPr>
-        <w:spacing w:before="100" w:beforeAutospacing="1" w:after="100" w:afterAutospacing="1"/>
-      </w:pPr>
-      <w:r>
-        <w:rPr>
-          <w:rStyle w:val="Strong"/>
-        </w:rPr>
-        <w:t>C2 and C8 formed clearer clusters</w:t>
-      </w:r>
-    </w:p>
-    <w:p>
-      <w:pPr>
-        <w:numPr>
-          <w:ilvl w:val="1"/>
-          <w:numId w:val="56"/>
-        </w:numPr>
-        <w:spacing w:before="100" w:beforeAutospacing="1" w:after="100" w:afterAutospacing="1"/>
-      </w:pPr>
-      <w:r>
-        <w:t>other RCA categories showed partial overlap.</w:t>
-      </w:r>
-    </w:p>
-    <w:p>
-      <w:pPr>
-        <w:numPr>
-          <w:ilvl w:val="0"/>
-          <w:numId w:val="56"/>
-        </w:numPr>
-        <w:spacing w:before="100" w:beforeAutospacing="1" w:after="100" w:afterAutospacing="1"/>
-      </w:pPr>
-      <w:r>
-        <w:rPr>
-          <w:rStyle w:val="Strong"/>
-        </w:rPr>
-        <w:t>Key takeaway:</w:t>
-      </w:r>
-      <w:r>
-        <w:t xml:space="preserve"> RCA classes occupy identifiable regions in feature space, supporting the feasibility of ML-based classification.</w:t>
-      </w:r>
-    </w:p>
-    <w:p>
-      <w:pPr>
-        <w:spacing w:after="0"/>
-      </w:pPr>
-      <w:r>
-        <w:rPr>
-          <w:noProof/>
-        </w:rPr>
-        <w:pict w14:anchorId="0880B9EC">
-          <v:rect id="_x0000_i1031" alt="" style="width:468pt;height:.05pt;mso-width-percent:0;mso-height-percent:0;mso-width-percent:0;mso-height-percent:0" o:hralign="center" o:hrstd="t" o:hr="t" fillcolor="#a0a0a0" stroked="f"/>
-        </w:pict>
-      </w:r>
-    </w:p>
-    <w:p>
-      <w:pPr>
-        <w:pStyle w:val="Heading3"/>
-      </w:pPr>
-      <w:r>
-        <w:t xml:space="preserve">5. Antenna Model Affects Throughput but Not RCA </w:t>
-      </w:r>
-      <w:r>
-        <w:rPr>
-          <w:rFonts w:ascii="Apple Color Emoji" w:hAnsi="Apple Color Emoji" w:cs="Apple Color Emoji"/>
-        </w:rPr>
-        <w:t>⭐⭐⭐</w:t>
-      </w:r>
-    </w:p>
-    <w:p>
-      <w:pPr>
-        <w:numPr>
-          <w:ilvl w:val="0"/>
-          <w:numId w:val="57"/>
-        </w:numPr>
-        <w:spacing w:before="100" w:beforeAutospacing="1" w:after="100" w:afterAutospacing="1"/>
-      </w:pPr>
-      <w:r>
-        <w:t xml:space="preserve">Antenna model showed </w:t>
-      </w:r>
-      <w:r>
-        <w:rPr>
-          <w:rStyle w:val="Strong"/>
-        </w:rPr>
-        <w:t>noticeable throughput differences</w:t>
-      </w:r>
-      <w:r>
-        <w:t>:</w:t>
-      </w:r>
-    </w:p>
-    <w:p>
-      <w:pPr>
-        <w:numPr>
-          <w:ilvl w:val="1"/>
-          <w:numId w:val="57"/>
-        </w:numPr>
-        <w:spacing w:before="100" w:beforeAutospacing="1" w:after="100" w:afterAutospacing="1"/>
-      </w:pPr>
-      <w:r>
-        <w:rPr>
-          <w:rStyle w:val="Strong"/>
-        </w:rPr>
-        <w:t>NR AAU 1 → highest throughput</w:t>
-      </w:r>
-    </w:p>
-    <w:p>
-      <w:pPr>
-        <w:numPr>
-          <w:ilvl w:val="1"/>
-          <w:numId w:val="57"/>
-        </w:numPr>
-        <w:spacing w:before="100" w:beforeAutospacing="1" w:after="100" w:afterAutospacing="1"/>
-      </w:pPr>
-      <w:r>
-        <w:rPr>
-          <w:rStyle w:val="Strong"/>
-        </w:rPr>
-        <w:t>NR AAU 3 → lowest throughput</w:t>
-      </w:r>
-    </w:p>
-    <w:p>
-      <w:pPr>
-        <w:numPr>
-          <w:ilvl w:val="0"/>
-          <w:numId w:val="57"/>
-        </w:numPr>
-        <w:spacing w:before="100" w:beforeAutospacing="1" w:after="100" w:afterAutospacing="1"/>
-      </w:pPr>
-      <w:r>
-        <w:t>Interestingly:</w:t>
-      </w:r>
-    </w:p>
-    <w:p>
-      <w:pPr>
-        <w:numPr>
-          <w:ilvl w:val="1"/>
-          <w:numId w:val="57"/>
-        </w:numPr>
-        <w:spacing w:before="100" w:beforeAutospacing="1" w:after="100" w:afterAutospacing="1"/>
-      </w:pPr>
-      <w:r>
-        <w:rPr>
-          <w:rStyle w:val="Strong"/>
-        </w:rPr>
-        <w:t>NR AAU 3 had the strongest SINR but lowest throughput efficiency</w:t>
-      </w:r>
-      <w:r>
-        <w:t>.</w:t>
-      </w:r>
-    </w:p>
-    <w:p>
-      <w:pPr>
-        <w:numPr>
-          <w:ilvl w:val="0"/>
-          <w:numId w:val="57"/>
-        </w:numPr>
-        <w:spacing w:before="100" w:beforeAutospacing="1" w:after="100" w:afterAutospacing="1"/>
-      </w:pPr>
-      <w:r>
-        <w:t>However, antenna model distribution across RCA categories remained nearly identical.</w:t>
-      </w:r>
-    </w:p>
-    <w:p>
-      <w:pPr>
-        <w:numPr>
-          <w:ilvl w:val="0"/>
-          <w:numId w:val="57"/>
-        </w:numPr>
-        <w:spacing w:before="100" w:beforeAutospacing="1" w:after="100" w:afterAutospacing="1"/>
-      </w:pPr>
-      <w:r>
-        <w:rPr>
-          <w:rStyle w:val="Strong"/>
-        </w:rPr>
-        <w:t>Key takeaway:</w:t>
-      </w:r>
-      <w:r>
-        <w:t xml:space="preserve"> Antenna model may influence throughput efficiency but does </w:t>
-      </w:r>
-      <w:r>
-        <w:rPr>
-          <w:rStyle w:val="Strong"/>
-        </w:rPr>
-        <w:t>not strongly explain root cause mechanisms</w:t>
-      </w:r>
-      <w:r>
-        <w:t>.</w:t>
-      </w:r>
-    </w:p>
-    <w:p>
-      <w:r>
-        <w:br w:type="page"/>
-      </w:r>
-    </w:p>
-    <w:p>
-      <w:pPr>
-        <w:pStyle w:val="Heading2"/>
-      </w:pPr>
-      <w:r>
-        <w:lastRenderedPageBreak/>
-        <w:t>Feature Engineering Summary and RCA-Relevant Features</w:t>
-      </w:r>
-    </w:p>
-    <w:p>
-      <w:pPr>
-        <w:pStyle w:val="NormalWeb"/>
-      </w:pPr>
-      <w:r>
-        <w:t xml:space="preserve">Rather than relying solely on raw telecom KPIs, additional </w:t>
-      </w:r>
-      <w:r>
-        <w:rPr>
-          <w:rStyle w:val="Strong"/>
-        </w:rPr>
-        <w:t>scenario-level engineered features</w:t>
-      </w:r>
-      <w:r>
-        <w:t xml:space="preserve"> were created to better capture the behavioral patterns associated with different RCA categories. Since RCA mechanisms are often driven by combinations of radio conditions, mobility, interference, and resource allocation behaviors, feature engineering focused on transforming raw time-series measurements into interpretable telecom indicators.</w:t>
-      </w:r>
-    </w:p>
-    <w:p>
-      <w:pPr>
-        <w:pStyle w:val="Heading3"/>
-      </w:pPr>
-      <w:r>
-        <w:t>Throughput Behavior Features</w:t>
-      </w:r>
-    </w:p>
-    <w:p>
-      <w:pPr>
-        <w:pStyle w:val="NormalWeb"/>
-      </w:pPr>
-      <w:r>
-        <w:t>These features summarized throughput degradation patterns and helped distinguish severe versus mild degradation mechanisms.</w:t>
-      </w:r>
-    </w:p>
-    <w:p>
-      <w:pPr>
-        <w:pStyle w:val="NormalWeb"/>
-        <w:numPr>
-          <w:ilvl w:val="0"/>
-          <w:numId w:val="58"/>
-        </w:numPr>
-      </w:pPr>
-      <w:r>
-        <w:rPr>
-          <w:rStyle w:val="Strong"/>
-        </w:rPr>
-        <w:t>avg_throughput</w:t>
-      </w:r>
-      <w:r>
-        <w:t xml:space="preserve"> → average throughput across the scenario</w:t>
-      </w:r>
-    </w:p>
-    <w:p>
-      <w:pPr>
-        <w:pStyle w:val="NormalWeb"/>
-        <w:numPr>
-          <w:ilvl w:val="0"/>
-          <w:numId w:val="58"/>
-        </w:numPr>
-      </w:pPr>
-      <w:r>
-        <w:rPr>
-          <w:rStyle w:val="Strong"/>
-        </w:rPr>
-        <w:t>min_throughput</w:t>
-      </w:r>
-      <w:r>
-        <w:t xml:space="preserve"> → worst-case throughput condition</w:t>
-      </w:r>
-    </w:p>
-    <w:p>
-      <w:pPr>
-        <w:pStyle w:val="NormalWeb"/>
-        <w:numPr>
-          <w:ilvl w:val="0"/>
-          <w:numId w:val="58"/>
-        </w:numPr>
-      </w:pPr>
-      <w:r>
-        <w:rPr>
-          <w:rStyle w:val="Strong"/>
-        </w:rPr>
-        <w:t>std_throughput</w:t>
-      </w:r>
-      <w:r>
-        <w:t xml:space="preserve"> → throughput instability/variation</w:t>
-      </w:r>
-    </w:p>
-    <w:p>
-      <w:pPr>
-        <w:pStyle w:val="NormalWeb"/>
-        <w:numPr>
-          <w:ilvl w:val="0"/>
-          <w:numId w:val="58"/>
-        </w:numPr>
-      </w:pPr>
-      <w:r>
-        <w:rPr>
-          <w:rStyle w:val="Strong"/>
-        </w:rPr>
-        <w:t>low_tp_ratio</w:t>
-      </w:r>
-      <w:r>
-        <w:t xml:space="preserve"> → percentage of time throughput remained below threshold</w:t>
-      </w:r>
-    </w:p>
-    <w:p>
-      <w:pPr>
-        <w:pStyle w:val="NormalWeb"/>
-        <w:numPr>
-          <w:ilvl w:val="0"/>
-          <w:numId w:val="58"/>
-        </w:numPr>
-      </w:pPr>
-      <w:r>
-        <w:rPr>
-          <w:rStyle w:val="Strong"/>
-        </w:rPr>
-        <w:t>avg_throughput_low_tp</w:t>
-      </w:r>
-      <w:r>
-        <w:t xml:space="preserve"> → throughput during degraded periods</w:t>
-      </w:r>
-    </w:p>
-    <w:p>
-      <w:pPr>
-        <w:pStyle w:val="NormalWeb"/>
-        <w:numPr>
-          <w:ilvl w:val="0"/>
-          <w:numId w:val="58"/>
-        </w:numPr>
-      </w:pPr>
-      <w:r>
-        <w:rPr>
-          <w:rStyle w:val="Strong"/>
-        </w:rPr>
-        <w:t>consecutive_low_tp_max</w:t>
-      </w:r>
-      <w:r>
-        <w:t xml:space="preserve"> → longest continuous degradation duration</w:t>
-      </w:r>
-    </w:p>
-    <w:p>
-      <w:pPr>
-        <w:pStyle w:val="NormalWeb"/>
-      </w:pPr>
-      <w:r>
-        <w:rPr>
-          <w:rStyle w:val="Strong"/>
-        </w:rPr>
-        <w:t>Helped identify:</w:t>
-      </w:r>
-    </w:p>
-    <w:p>
-      <w:pPr>
-        <w:pStyle w:val="NormalWeb"/>
-        <w:numPr>
-          <w:ilvl w:val="0"/>
-          <w:numId w:val="59"/>
-        </w:numPr>
-      </w:pPr>
-      <w:r>
-        <w:rPr>
-          <w:rStyle w:val="Strong"/>
-        </w:rPr>
-        <w:t>C3:</w:t>
-      </w:r>
-      <w:r>
-        <w:t xml:space="preserve"> stable/high throughput despite neighboring-cell issue</w:t>
-      </w:r>
-    </w:p>
-    <w:p>
-      <w:pPr>
-        <w:pStyle w:val="NormalWeb"/>
-        <w:numPr>
-          <w:ilvl w:val="0"/>
-          <w:numId w:val="59"/>
-        </w:numPr>
-      </w:pPr>
-      <w:r>
-        <w:rPr>
-          <w:rStyle w:val="Strong"/>
-        </w:rPr>
-        <w:t>C8:</w:t>
-      </w:r>
-      <w:r>
-        <w:t xml:space="preserve"> consistently degraded throughput behavior</w:t>
-      </w:r>
-    </w:p>
-    <w:p>
-      <w:r>
-        <w:rPr>
-          <w:noProof/>
-        </w:rPr>
-        <w:pict w14:anchorId="0D184735">
-          <v:rect id="_x0000_i1030" alt="" style="width:468pt;height:.05pt;mso-width-percent:0;mso-height-percent:0;mso-width-percent:0;mso-height-percent:0" o:hralign="center" o:hrstd="t" o:hr="t" fillcolor="#a0a0a0" stroked="f"/>
-        </w:pict>
-      </w:r>
-    </w:p>
-    <w:p>
-      <w:pPr>
-        <w:pStyle w:val="Heading3"/>
-      </w:pPr>
-      <w:r>
-        <w:t>Mobility &amp; Handover Features</w:t>
-      </w:r>
-    </w:p>
-    <w:p>
-      <w:pPr>
-        <w:pStyle w:val="NormalWeb"/>
-      </w:pPr>
-      <w:r>
-        <w:t>Mobility-related features were engineered to quantify serving-cell instability and movement behavior.</w:t>
-      </w:r>
-    </w:p>
-    <w:p>
-      <w:pPr>
-        <w:pStyle w:val="NormalWeb"/>
-        <w:numPr>
-          <w:ilvl w:val="0"/>
-          <w:numId w:val="60"/>
-        </w:numPr>
-      </w:pPr>
-      <w:r>
-        <w:rPr>
-          <w:rStyle w:val="Strong"/>
-        </w:rPr>
-        <w:t>handover_count</w:t>
-      </w:r>
-      <w:r>
-        <w:t xml:space="preserve"> → number of serving-cell changes</w:t>
-      </w:r>
-    </w:p>
-    <w:p>
-      <w:pPr>
-        <w:pStyle w:val="NormalWeb"/>
-        <w:numPr>
-          <w:ilvl w:val="0"/>
-          <w:numId w:val="60"/>
-        </w:numPr>
-      </w:pPr>
-      <w:r>
-        <w:rPr>
-          <w:rStyle w:val="Strong"/>
-        </w:rPr>
-        <w:t>handover_rate</w:t>
-      </w:r>
-      <w:r>
-        <w:t xml:space="preserve"> → handovers normalized by scenario duration</w:t>
-      </w:r>
-    </w:p>
-    <w:p>
-      <w:pPr>
-        <w:pStyle w:val="NormalWeb"/>
-        <w:numPr>
-          <w:ilvl w:val="0"/>
-          <w:numId w:val="60"/>
-        </w:numPr>
-      </w:pPr>
-      <w:r>
-        <w:rPr>
-          <w:rStyle w:val="Strong"/>
-        </w:rPr>
-        <w:t>num_unique_serving_pci</w:t>
-      </w:r>
-      <w:r>
-        <w:t xml:space="preserve"> → number of serving cells observed</w:t>
-      </w:r>
-    </w:p>
-    <w:p>
-      <w:pPr>
-        <w:pStyle w:val="NormalWeb"/>
-        <w:numPr>
-          <w:ilvl w:val="0"/>
-          <w:numId w:val="60"/>
-        </w:numPr>
-      </w:pPr>
-      <w:r>
-        <w:rPr>
-          <w:rStyle w:val="Strong"/>
-        </w:rPr>
-        <w:t>pct_speed_above_40</w:t>
-      </w:r>
-      <w:r>
-        <w:t xml:space="preserve"> → proportion of time vehicle exceeded 40 km/h</w:t>
-      </w:r>
-    </w:p>
-    <w:p>
-      <w:pPr>
-        <w:pStyle w:val="NormalWeb"/>
-      </w:pPr>
-      <w:r>
-        <w:rPr>
-          <w:rStyle w:val="Strong"/>
-        </w:rPr>
-        <w:t>Helped identify:</w:t>
-      </w:r>
-    </w:p>
-    <w:p>
-      <w:pPr>
-        <w:pStyle w:val="NormalWeb"/>
-        <w:numPr>
-          <w:ilvl w:val="0"/>
-          <w:numId w:val="61"/>
-        </w:numPr>
-      </w:pPr>
-      <w:r>
-        <w:rPr>
-          <w:rStyle w:val="Strong"/>
-        </w:rPr>
-        <w:t>C5:</w:t>
-      </w:r>
-      <w:r>
-        <w:t xml:space="preserve"> excessive handovers and serving-cell instability</w:t>
-      </w:r>
-    </w:p>
-    <w:p>
-      <w:pPr>
-        <w:pStyle w:val="NormalWeb"/>
-        <w:numPr>
-          <w:ilvl w:val="0"/>
-          <w:numId w:val="61"/>
-        </w:numPr>
-      </w:pPr>
-      <w:r>
-        <w:rPr>
-          <w:rStyle w:val="Strong"/>
-        </w:rPr>
-        <w:t>C7:</w:t>
-      </w:r>
-      <w:r>
-        <w:t xml:space="preserve"> mobility-related degradation at higher speeds</w:t>
-      </w:r>
-    </w:p>
-    <w:p>
-      <w:r>
-        <w:rPr>
-          <w:noProof/>
-        </w:rPr>
-        <w:pict w14:anchorId="4E20B530">
-          <v:rect id="_x0000_i1029" alt="" style="width:468pt;height:.05pt;mso-width-percent:0;mso-height-percent:0;mso-width-percent:0;mso-height-percent:0" o:hralign="center" o:hrstd="t" o:hr="t" fillcolor="#a0a0a0" stroked="f"/>
-        </w:pict>
-      </w:r>
-    </w:p>
-    <w:p>
-      <w:pPr>
-        <w:pStyle w:val="Heading3"/>
-      </w:pPr>
-      <w:r>
-        <w:lastRenderedPageBreak/>
-        <w:t>Signal Quality Features (RSRP / SINR)</w:t>
-      </w:r>
-    </w:p>
-    <w:p>
-      <w:pPr>
-        <w:pStyle w:val="NormalWeb"/>
-      </w:pPr>
-      <w:r>
-        <w:t>RF signal features summarized signal strength and cleanliness.</w:t>
-      </w:r>
-    </w:p>
-    <w:p>
-      <w:pPr>
-        <w:pStyle w:val="NormalWeb"/>
-        <w:numPr>
-          <w:ilvl w:val="0"/>
-          <w:numId w:val="62"/>
-        </w:numPr>
-      </w:pPr>
-      <w:r>
-        <w:rPr>
-          <w:rStyle w:val="Strong"/>
-        </w:rPr>
-        <w:t>avg_rsrp / min_rsrp</w:t>
-      </w:r>
-      <w:r>
-        <w:t xml:space="preserve"> → serving signal strength</w:t>
-      </w:r>
-    </w:p>
-    <w:p>
-      <w:pPr>
-        <w:pStyle w:val="NormalWeb"/>
-        <w:numPr>
-          <w:ilvl w:val="0"/>
-          <w:numId w:val="62"/>
-        </w:numPr>
-      </w:pPr>
-      <w:r>
-        <w:rPr>
-          <w:rStyle w:val="Strong"/>
-        </w:rPr>
-        <w:t>avg_sinr / min_sinr</w:t>
-      </w:r>
-      <w:r>
-        <w:t xml:space="preserve"> → interference and signal quality</w:t>
-      </w:r>
-    </w:p>
-    <w:p>
-      <w:pPr>
-        <w:pStyle w:val="NormalWeb"/>
-        <w:numPr>
-          <w:ilvl w:val="0"/>
-          <w:numId w:val="62"/>
-        </w:numPr>
-      </w:pPr>
-      <w:r>
-        <w:rPr>
-          <w:rStyle w:val="Strong"/>
-        </w:rPr>
-        <w:t>std_sinr</w:t>
-      </w:r>
-      <w:r>
-        <w:t xml:space="preserve"> → signal quality instability</w:t>
-      </w:r>
-    </w:p>
-    <w:p>
-      <w:pPr>
-        <w:pStyle w:val="NormalWeb"/>
-        <w:numPr>
-          <w:ilvl w:val="0"/>
-          <w:numId w:val="62"/>
-        </w:numPr>
-      </w:pPr>
-      <w:r>
-        <w:rPr>
-          <w:rStyle w:val="Strong"/>
-        </w:rPr>
-        <w:t>pct_sinr_below_5</w:t>
-      </w:r>
-      <w:r>
-        <w:t xml:space="preserve"> → frequency of poor SINR conditions</w:t>
-      </w:r>
-    </w:p>
-    <w:p>
-      <w:pPr>
-        <w:pStyle w:val="NormalWeb"/>
-      </w:pPr>
-      <w:r>
-        <w:rPr>
-          <w:rStyle w:val="Strong"/>
-        </w:rPr>
-        <w:t>Helped identify:</w:t>
-      </w:r>
-    </w:p>
-    <w:p>
-      <w:pPr>
-        <w:pStyle w:val="NormalWeb"/>
-        <w:numPr>
-          <w:ilvl w:val="0"/>
-          <w:numId w:val="63"/>
-        </w:numPr>
-      </w:pPr>
-      <w:r>
-        <w:t>interference-related RCA behavior</w:t>
-      </w:r>
-    </w:p>
-    <w:p>
-      <w:pPr>
-        <w:pStyle w:val="NormalWeb"/>
-        <w:numPr>
-          <w:ilvl w:val="0"/>
-          <w:numId w:val="63"/>
-        </w:numPr>
-      </w:pPr>
-      <w:r>
-        <w:t>differences in RF environments across scenarios</w:t>
-      </w:r>
-    </w:p>
-    <w:p>
-      <w:r>
-        <w:rPr>
-          <w:noProof/>
-        </w:rPr>
-        <w:pict w14:anchorId="51B29CFA">
-          <v:rect id="_x0000_i1028" alt="" style="width:468pt;height:.05pt;mso-width-percent:0;mso-height-percent:0;mso-width-percent:0;mso-height-percent:0" o:hralign="center" o:hrstd="t" o:hr="t" fillcolor="#a0a0a0" stroked="f"/>
-        </w:pict>
-      </w:r>
-    </w:p>
-    <w:p>
-      <w:pPr>
-        <w:pStyle w:val="Heading3"/>
-      </w:pPr>
-      <w:r>
-        <w:t>Resource Allocation Features (RB)</w:t>
-      </w:r>
-    </w:p>
-    <w:p>
-      <w:pPr>
-        <w:pStyle w:val="NormalWeb"/>
-      </w:pPr>
-      <w:r>
-        <w:t>Radio resource block features captured scheduling and resource sufficiency behavior.</w:t>
-      </w:r>
-    </w:p>
-    <w:p>
-      <w:pPr>
-        <w:pStyle w:val="NormalWeb"/>
-        <w:numPr>
-          <w:ilvl w:val="0"/>
-          <w:numId w:val="64"/>
-        </w:numPr>
-      </w:pPr>
-      <w:r>
-        <w:rPr>
-          <w:rStyle w:val="Strong"/>
-        </w:rPr>
-        <w:t>avg_rb / min_rb</w:t>
-      </w:r>
-      <w:r>
-        <w:t xml:space="preserve"> → RB allocation levels</w:t>
-      </w:r>
-    </w:p>
-    <w:p>
-      <w:pPr>
-        <w:pStyle w:val="NormalWeb"/>
-        <w:numPr>
-          <w:ilvl w:val="0"/>
-          <w:numId w:val="64"/>
-        </w:numPr>
-      </w:pPr>
-      <w:r>
-        <w:rPr>
-          <w:rStyle w:val="Strong"/>
-        </w:rPr>
-        <w:t>avg_rb_low_tp</w:t>
-      </w:r>
-      <w:r>
-        <w:t xml:space="preserve"> → RB allocation during degradation</w:t>
-      </w:r>
-    </w:p>
-    <w:p>
-      <w:pPr>
-        <w:pStyle w:val="NormalWeb"/>
-        <w:numPr>
-          <w:ilvl w:val="0"/>
-          <w:numId w:val="64"/>
-        </w:numPr>
-      </w:pPr>
-      <w:r>
-        <w:rPr>
-          <w:rStyle w:val="Strong"/>
-        </w:rPr>
-        <w:t>pct_rb_below_160</w:t>
-      </w:r>
-      <w:r>
-        <w:t xml:space="preserve"> → proportion of time with insufficient RB allocation</w:t>
-      </w:r>
-    </w:p>
-    <w:p>
-      <w:pPr>
-        <w:pStyle w:val="NormalWeb"/>
-      </w:pPr>
-      <w:r>
-        <w:rPr>
-          <w:rStyle w:val="Strong"/>
-        </w:rPr>
-        <w:t>Helped identify:</w:t>
-      </w:r>
-    </w:p>
-    <w:p>
-      <w:pPr>
-        <w:pStyle w:val="NormalWeb"/>
-        <w:numPr>
-          <w:ilvl w:val="0"/>
-          <w:numId w:val="65"/>
-        </w:numPr>
-      </w:pPr>
-      <w:r>
-        <w:rPr>
-          <w:rStyle w:val="Strong"/>
-        </w:rPr>
-        <w:t>C8:</w:t>
-      </w:r>
-      <w:r>
-        <w:t xml:space="preserve"> resource insufficiency (strongest feature group)</w:t>
-      </w:r>
-    </w:p>
-    <w:p>
-      <w:r>
-        <w:rPr>
-          <w:noProof/>
-        </w:rPr>
-        <w:pict w14:anchorId="116B4D9B">
-          <v:rect id="_x0000_i1027" alt="" style="width:468pt;height:.05pt;mso-width-percent:0;mso-height-percent:0;mso-width-percent:0;mso-height-percent:0" o:hralign="center" o:hrstd="t" o:hr="t" fillcolor="#a0a0a0" stroked="f"/>
-        </w:pict>
-      </w:r>
-    </w:p>
-    <w:p>
-      <w:pPr>
-        <w:pStyle w:val="Heading3"/>
-      </w:pPr>
-      <w:r>
-        <w:t>Neighbor &amp; Overlap Features</w:t>
-      </w:r>
-    </w:p>
-    <w:p>
-      <w:pPr>
-        <w:pStyle w:val="NormalWeb"/>
-      </w:pPr>
-      <w:r>
-        <w:t>Neighbor-cell features quantified competition between serving and neighboring cells.</w:t>
-      </w:r>
-    </w:p>
-    <w:p>
-      <w:pPr>
-        <w:pStyle w:val="NormalWeb"/>
-        <w:numPr>
-          <w:ilvl w:val="0"/>
-          <w:numId w:val="66"/>
-        </w:numPr>
-      </w:pPr>
-      <w:r>
-        <w:rPr>
-          <w:rStyle w:val="Strong"/>
-        </w:rPr>
-        <w:t>avg_neighbor_advantage</w:t>
-      </w:r>
-      <w:r>
-        <w:t xml:space="preserve"> → strongest neighbor signal relative to serving signal</w:t>
-      </w:r>
-    </w:p>
-    <w:p>
-      <w:pPr>
-        <w:pStyle w:val="NormalWeb"/>
-        <w:numPr>
-          <w:ilvl w:val="0"/>
-          <w:numId w:val="66"/>
-        </w:numPr>
-      </w:pPr>
-      <w:r>
-        <w:rPr>
-          <w:rStyle w:val="Strong"/>
-        </w:rPr>
-        <w:t>neighbor_stronger_ratio</w:t>
-      </w:r>
-      <w:r>
-        <w:t xml:space="preserve"> → frequency neighbors outperformed serving signal</w:t>
-      </w:r>
-    </w:p>
-    <w:p>
-      <w:pPr>
-        <w:pStyle w:val="NormalWeb"/>
-        <w:numPr>
-          <w:ilvl w:val="0"/>
-          <w:numId w:val="66"/>
-        </w:numPr>
-      </w:pPr>
-      <w:r>
-        <w:rPr>
-          <w:rStyle w:val="Strong"/>
-        </w:rPr>
-        <w:t>avg_close_neighbor_count</w:t>
-      </w:r>
-      <w:r>
-        <w:t xml:space="preserve"> → nearby competing neighbors</w:t>
-      </w:r>
-    </w:p>
-    <w:p>
-      <w:pPr>
-        <w:pStyle w:val="NormalWeb"/>
-        <w:numPr>
-          <w:ilvl w:val="0"/>
-          <w:numId w:val="66"/>
-        </w:numPr>
-      </w:pPr>
-      <w:r>
-        <w:rPr>
-          <w:rStyle w:val="Strong"/>
-        </w:rPr>
-        <w:t>overlap_ratio</w:t>
-      </w:r>
-      <w:r>
-        <w:t xml:space="preserve"> → overlapping coverage severity</w:t>
-      </w:r>
-    </w:p>
-    <w:p>
-      <w:pPr>
-        <w:pStyle w:val="NormalWeb"/>
-      </w:pPr>
-      <w:r>
-        <w:rPr>
-          <w:rStyle w:val="Strong"/>
-        </w:rPr>
-        <w:t>Helped identify:</w:t>
-      </w:r>
-    </w:p>
-    <w:p>
-      <w:pPr>
-        <w:pStyle w:val="NormalWeb"/>
-        <w:numPr>
-          <w:ilvl w:val="0"/>
-          <w:numId w:val="67"/>
-        </w:numPr>
-      </w:pPr>
-      <w:r>
-        <w:rPr>
-          <w:rStyle w:val="Strong"/>
-        </w:rPr>
-        <w:t>C4:</w:t>
-      </w:r>
-      <w:r>
-        <w:t xml:space="preserve"> overlapping coverage/interference</w:t>
-      </w:r>
-    </w:p>
-    <w:p>
-      <w:pPr>
-        <w:pStyle w:val="NormalWeb"/>
-        <w:numPr>
-          <w:ilvl w:val="0"/>
-          <w:numId w:val="67"/>
-        </w:numPr>
-      </w:pPr>
-      <w:r>
-        <w:rPr>
-          <w:rStyle w:val="Strong"/>
-        </w:rPr>
-        <w:t>C3:</w:t>
-      </w:r>
-      <w:r>
-        <w:t xml:space="preserve"> competitive neighboring-cell environment</w:t>
-      </w:r>
-    </w:p>
-    <w:p>
-      <w:r>
-        <w:rPr>
-          <w:noProof/>
-        </w:rPr>
-        <w:pict w14:anchorId="272EDA51">
-          <v:rect id="_x0000_i1026" alt="" style="width:468pt;height:.05pt;mso-width-percent:0;mso-height-percent:0;mso-width-percent:0;mso-height-percent:0" o:hralign="center" o:hrstd="t" o:hr="t" fillcolor="#a0a0a0" stroked="f"/>
-        </w:pict>
-      </w:r>
-    </w:p>
-    <w:p>
-      <w:pPr>
-        <w:pStyle w:val="Heading3"/>
-      </w:pPr>
-      <w:r>
         <w:lastRenderedPageBreak/>
         <w:t>PCI Conflict Features</w:t>
       </w:r>
@@ -4186,8 +4186,8 @@
         <w:rPr>
           <w:noProof/>
         </w:rPr>
-        <w:pict w14:anchorId="1B20AC93">
-          <v:rect id="_x0000_i1025" alt="" style="width:468pt;height:.05pt;mso-width-percent:0;mso-height-percent:0;mso-width-percent:0;mso-height-percent:0" o:hralign="center" o:hrstd="t" o:hr="t" fillcolor="#a0a0a0" stroked="f"/>
+        <w:pict w14:anchorId="4679FCA7">
+          <v:rect id="_x0000_i1032" alt="" style="width:468pt;height:.05pt;mso-width-percent:0;mso-height-percent:0;mso-width-percent:0;mso-height-percent:0" o:hralign="center" o:hrstd="t" o:hr="t" fillcolor="#a0a0a0" stroked="f"/>
         </w:pict>
       </w:r>
     </w:p>
@@ -4318,6 +4318,769 @@
     <w:bookmarkEnd w:id="0"/>
     <w:bookmarkEnd w:id="30"/>
     <w:bookmarkEnd w:id="32"/>
+    <w:p>
+      <w:r>
+        <w:br w:type="page"/>
+      </w:r>
+    </w:p>
+    <w:p>
+      <w:pPr>
+        <w:pStyle w:val="Heading2"/>
+      </w:pPr>
+      <w:r>
+        <w:lastRenderedPageBreak/>
+        <w:t>Business Interpretation of TP, FP, FN, and TN for Each RCA</w:t>
+      </w:r>
+    </w:p>
+    <w:p>
+      <w:pPr>
+        <w:pStyle w:val="Heading3"/>
+      </w:pPr>
+      <w:r>
+        <w:t>C1: Excessive downtilt causing weak far-edge coverage</w:t>
+      </w:r>
+    </w:p>
+    <w:p>
+      <w:pPr>
+        <w:pStyle w:val="NormalWeb"/>
+        <w:numPr>
+          <w:ilvl w:val="0"/>
+          <w:numId w:val="72"/>
+        </w:numPr>
+      </w:pPr>
+      <w:r>
+        <w:rPr>
+          <w:rStyle w:val="Strong"/>
+        </w:rPr>
+        <w:t>TP (True Positive):</w:t>
+      </w:r>
+      <w:r>
+        <w:br/>
+        <w:t>Excessive downtilt was truly causing weak far-edge coverage, and the model correctly identified C1. Engineers can quickly adjust antenna tilt and improve coverage.</w:t>
+      </w:r>
+    </w:p>
+    <w:p>
+      <w:pPr>
+        <w:pStyle w:val="NormalWeb"/>
+        <w:numPr>
+          <w:ilvl w:val="0"/>
+          <w:numId w:val="72"/>
+        </w:numPr>
+      </w:pPr>
+      <w:r>
+        <w:rPr>
+          <w:rStyle w:val="Strong"/>
+        </w:rPr>
+        <w:t>FP (False Positive):</w:t>
+      </w:r>
+      <w:r>
+        <w:br/>
+        <w:t>The issue was not excessive downtilt, but the model predicted C1. Engineers may unnecessarily investigate antenna tilt or modify coverage parameters, wasting engineering effort.</w:t>
+      </w:r>
+    </w:p>
+    <w:p>
+      <w:pPr>
+        <w:pStyle w:val="NormalWeb"/>
+        <w:numPr>
+          <w:ilvl w:val="0"/>
+          <w:numId w:val="72"/>
+        </w:numPr>
+      </w:pPr>
+      <w:r>
+        <w:rPr>
+          <w:rStyle w:val="Strong"/>
+        </w:rPr>
+        <w:t>FN (False Negative):</w:t>
+      </w:r>
+      <w:r>
+        <w:br/>
+        <w:t>Excessive downtilt was the true root cause, but the model failed to identify C1. Weak coverage remains unresolved, potentially causing continued throughput degradation and poor user experience.</w:t>
+      </w:r>
+    </w:p>
+    <w:p>
+      <w:pPr>
+        <w:pStyle w:val="NormalWeb"/>
+        <w:numPr>
+          <w:ilvl w:val="0"/>
+          <w:numId w:val="72"/>
+        </w:numPr>
+      </w:pPr>
+      <w:r>
+        <w:rPr>
+          <w:rStyle w:val="Strong"/>
+        </w:rPr>
+        <w:t>TN (True Negative):</w:t>
+      </w:r>
+      <w:r>
+        <w:br/>
+        <w:t>Excessive downtilt was not the root cause, and the model correctly ruled out C1.</w:t>
+      </w:r>
+    </w:p>
+    <w:p>
+      <w:r>
+        <w:rPr>
+          <w:noProof/>
+        </w:rPr>
+        <w:pict w14:anchorId="0E2FEBAF">
+          <v:rect id="_x0000_i1031" alt="" style="width:468pt;height:.05pt;mso-width-percent:0;mso-height-percent:0;mso-width-percent:0;mso-height-percent:0" o:hralign="center" o:hrstd="t" o:hr="t" fillcolor="#a0a0a0" stroked="f"/>
+        </w:pict>
+      </w:r>
+    </w:p>
+    <w:p>
+      <w:pPr>
+        <w:pStyle w:val="Heading3"/>
+      </w:pPr>
+      <w:r>
+        <w:t>C2: Over-shooting due to excessive coverage distance (&gt;1 km)</w:t>
+      </w:r>
+    </w:p>
+    <w:p>
+      <w:pPr>
+        <w:pStyle w:val="NormalWeb"/>
+        <w:numPr>
+          <w:ilvl w:val="0"/>
+          <w:numId w:val="73"/>
+        </w:numPr>
+      </w:pPr>
+      <w:r>
+        <w:rPr>
+          <w:rStyle w:val="Strong"/>
+        </w:rPr>
+        <w:t>TP:</w:t>
+      </w:r>
+      <w:r>
+        <w:br/>
+        <w:t>Overshooting was truly occurring and the model correctly identified it. Engineers can optimize coverage boundaries and reduce unintended dominance.</w:t>
+      </w:r>
+    </w:p>
+    <w:p>
+      <w:pPr>
+        <w:pStyle w:val="NormalWeb"/>
+        <w:numPr>
+          <w:ilvl w:val="0"/>
+          <w:numId w:val="73"/>
+        </w:numPr>
+      </w:pPr>
+      <w:r>
+        <w:rPr>
+          <w:rStyle w:val="Strong"/>
+        </w:rPr>
+        <w:t>FP:</w:t>
+      </w:r>
+      <w:r>
+        <w:br/>
+        <w:t>The issue was not overshooting, but engineers may unnecessarily adjust cell coverage or antenna parameters.</w:t>
+      </w:r>
+    </w:p>
+    <w:p>
+      <w:pPr>
+        <w:pStyle w:val="NormalWeb"/>
+        <w:numPr>
+          <w:ilvl w:val="0"/>
+          <w:numId w:val="73"/>
+        </w:numPr>
+      </w:pPr>
+      <w:r>
+        <w:rPr>
+          <w:rStyle w:val="Strong"/>
+        </w:rPr>
+        <w:t>FN:</w:t>
+      </w:r>
+      <w:r>
+        <w:br/>
+        <w:t>Overshooting existed but was missed. Poor mobility behavior, interference, and unnecessary handovers may continue.</w:t>
+      </w:r>
+    </w:p>
+    <w:p>
+      <w:pPr>
+        <w:pStyle w:val="NormalWeb"/>
+        <w:numPr>
+          <w:ilvl w:val="0"/>
+          <w:numId w:val="73"/>
+        </w:numPr>
+      </w:pPr>
+      <w:r>
+        <w:rPr>
+          <w:rStyle w:val="Strong"/>
+        </w:rPr>
+        <w:t>TN:</w:t>
+      </w:r>
+      <w:r>
+        <w:br/>
+        <w:t>Overshooting was not present and correctly ruled out.</w:t>
+      </w:r>
+    </w:p>
+    <w:p>
+      <w:r>
+        <w:rPr>
+          <w:noProof/>
+        </w:rPr>
+        <w:pict w14:anchorId="74F99B4E">
+          <v:rect id="_x0000_i1030" alt="" style="width:468pt;height:.05pt;mso-width-percent:0;mso-height-percent:0;mso-width-percent:0;mso-height-percent:0" o:hralign="center" o:hrstd="t" o:hr="t" fillcolor="#a0a0a0" stroked="f"/>
+        </w:pict>
+      </w:r>
+    </w:p>
+    <w:p>
+      <w:pPr>
+        <w:pStyle w:val="Heading3"/>
+      </w:pPr>
+      <w:r>
+        <w:t>C3: Neighboring cell providing higher throughput</w:t>
+      </w:r>
+    </w:p>
+    <w:p>
+      <w:pPr>
+        <w:pStyle w:val="NormalWeb"/>
+        <w:numPr>
+          <w:ilvl w:val="0"/>
+          <w:numId w:val="74"/>
+        </w:numPr>
+      </w:pPr>
+      <w:r>
+        <w:rPr>
+          <w:rStyle w:val="Strong"/>
+        </w:rPr>
+        <w:t>TP:</w:t>
+      </w:r>
+      <w:r>
+        <w:br/>
+        <w:t>A neighboring cell truly provided better performance and the model correctly identified a serving-cell selection issue.</w:t>
+      </w:r>
+    </w:p>
+    <w:p>
+      <w:pPr>
+        <w:pStyle w:val="NormalWeb"/>
+        <w:numPr>
+          <w:ilvl w:val="0"/>
+          <w:numId w:val="74"/>
+        </w:numPr>
+      </w:pPr>
+      <w:r>
+        <w:rPr>
+          <w:rStyle w:val="Strong"/>
+        </w:rPr>
+        <w:t>FP:</w:t>
+      </w:r>
+      <w:r>
+        <w:br/>
+        <w:t>The model incorrectly assumed neighboring-cell superiority, leading engineers to optimize mobility or reselection unnecessarily.</w:t>
+      </w:r>
+    </w:p>
+    <w:p>
+      <w:pPr>
+        <w:pStyle w:val="NormalWeb"/>
+        <w:numPr>
+          <w:ilvl w:val="0"/>
+          <w:numId w:val="74"/>
+        </w:numPr>
+      </w:pPr>
+      <w:r>
+        <w:rPr>
+          <w:rStyle w:val="Strong"/>
+        </w:rPr>
+        <w:lastRenderedPageBreak/>
+        <w:t>FN:</w:t>
+      </w:r>
+      <w:r>
+        <w:br/>
+        <w:t>Better neighboring performance existed but was missed. Users may continue connecting to suboptimal serving cells and experience reduced throughput.</w:t>
+      </w:r>
+    </w:p>
+    <w:p>
+      <w:pPr>
+        <w:pStyle w:val="NormalWeb"/>
+        <w:numPr>
+          <w:ilvl w:val="0"/>
+          <w:numId w:val="74"/>
+        </w:numPr>
+      </w:pPr>
+      <w:r>
+        <w:rPr>
+          <w:rStyle w:val="Strong"/>
+        </w:rPr>
+        <w:t>TN:</w:t>
+      </w:r>
+      <w:r>
+        <w:br/>
+        <w:t>No neighboring-cell performance issue existed and the model correctly rejected C3.</w:t>
+      </w:r>
+    </w:p>
+    <w:p>
+      <w:r>
+        <w:rPr>
+          <w:noProof/>
+        </w:rPr>
+        <w:pict w14:anchorId="53276BF9">
+          <v:rect id="_x0000_i1029" alt="" style="width:468pt;height:.05pt;mso-width-percent:0;mso-height-percent:0;mso-width-percent:0;mso-height-percent:0" o:hralign="center" o:hrstd="t" o:hr="t" fillcolor="#a0a0a0" stroked="f"/>
+        </w:pict>
+      </w:r>
+    </w:p>
+    <w:p>
+      <w:pPr>
+        <w:pStyle w:val="Heading3"/>
+      </w:pPr>
+      <w:r>
+        <w:t>C4: Severe overlapping coverage from non-colocated co-frequency cells</w:t>
+      </w:r>
+    </w:p>
+    <w:p>
+      <w:pPr>
+        <w:pStyle w:val="NormalWeb"/>
+        <w:numPr>
+          <w:ilvl w:val="0"/>
+          <w:numId w:val="75"/>
+        </w:numPr>
+      </w:pPr>
+      <w:r>
+        <w:rPr>
+          <w:rStyle w:val="Strong"/>
+        </w:rPr>
+        <w:t>TP:</w:t>
+      </w:r>
+      <w:r>
+        <w:br/>
+        <w:t>Severe overlapping coverage/interference truly existed and was correctly detected. Engineers can mitigate interference and improve SINR.</w:t>
+      </w:r>
+    </w:p>
+    <w:p>
+      <w:pPr>
+        <w:pStyle w:val="NormalWeb"/>
+        <w:numPr>
+          <w:ilvl w:val="0"/>
+          <w:numId w:val="75"/>
+        </w:numPr>
+      </w:pPr>
+      <w:r>
+        <w:rPr>
+          <w:rStyle w:val="Strong"/>
+        </w:rPr>
+        <w:t>FP:</w:t>
+      </w:r>
+      <w:r>
+        <w:br/>
+        <w:t>The model incorrectly predicted overlap interference, potentially leading to unnecessary interference mitigation actions.</w:t>
+      </w:r>
+    </w:p>
+    <w:p>
+      <w:pPr>
+        <w:pStyle w:val="NormalWeb"/>
+        <w:numPr>
+          <w:ilvl w:val="0"/>
+          <w:numId w:val="75"/>
+        </w:numPr>
+      </w:pPr>
+      <w:r>
+        <w:rPr>
+          <w:rStyle w:val="Strong"/>
+        </w:rPr>
+        <w:t>FN:</w:t>
+      </w:r>
+      <w:r>
+        <w:br/>
+        <w:t>Severe overlap/interference existed but was missed. SINR degradation, spectral inefficiency, and poor throughput may continue affecting many users.</w:t>
+      </w:r>
+    </w:p>
+    <w:p>
+      <w:pPr>
+        <w:pStyle w:val="NormalWeb"/>
+        <w:numPr>
+          <w:ilvl w:val="0"/>
+          <w:numId w:val="75"/>
+        </w:numPr>
+      </w:pPr>
+      <w:r>
+        <w:rPr>
+          <w:rStyle w:val="Strong"/>
+        </w:rPr>
+        <w:t>TN:</w:t>
+      </w:r>
+      <w:r>
+        <w:br/>
+        <w:t>Overlapping interference was not present and correctly ruled out.</w:t>
+      </w:r>
+    </w:p>
+    <w:p>
+      <w:r>
+        <w:rPr>
+          <w:noProof/>
+        </w:rPr>
+        <w:pict w14:anchorId="162AAB30">
+          <v:rect id="_x0000_i1028" alt="" style="width:468pt;height:.05pt;mso-width-percent:0;mso-height-percent:0;mso-width-percent:0;mso-height-percent:0" o:hralign="center" o:hrstd="t" o:hr="t" fillcolor="#a0a0a0" stroked="f"/>
+        </w:pict>
+      </w:r>
+    </w:p>
+    <w:p>
+      <w:pPr>
+        <w:pStyle w:val="Heading3"/>
+      </w:pPr>
+      <w:r>
+        <w:t>C5: Performance degradation due to frequent handovers</w:t>
+      </w:r>
+    </w:p>
+    <w:p>
+      <w:pPr>
+        <w:pStyle w:val="NormalWeb"/>
+        <w:numPr>
+          <w:ilvl w:val="0"/>
+          <w:numId w:val="76"/>
+        </w:numPr>
+      </w:pPr>
+      <w:r>
+        <w:rPr>
+          <w:rStyle w:val="Strong"/>
+        </w:rPr>
+        <w:t>TP:</w:t>
+      </w:r>
+      <w:r>
+        <w:br/>
+        <w:t>Frequent handovers were truly degrading performance and the model correctly identified the issue.</w:t>
+      </w:r>
+    </w:p>
+    <w:p>
+      <w:pPr>
+        <w:pStyle w:val="NormalWeb"/>
+        <w:numPr>
+          <w:ilvl w:val="0"/>
+          <w:numId w:val="76"/>
+        </w:numPr>
+      </w:pPr>
+      <w:r>
+        <w:rPr>
+          <w:rStyle w:val="Strong"/>
+        </w:rPr>
+        <w:t>FP:</w:t>
+      </w:r>
+      <w:r>
+        <w:br/>
+        <w:t>The model incorrectly predicted handover-related degradation, causing engineers to unnecessarily adjust mobility parameters.</w:t>
+      </w:r>
+    </w:p>
+    <w:p>
+      <w:pPr>
+        <w:pStyle w:val="NormalWeb"/>
+        <w:numPr>
+          <w:ilvl w:val="0"/>
+          <w:numId w:val="76"/>
+        </w:numPr>
+      </w:pPr>
+      <w:r>
+        <w:rPr>
+          <w:rStyle w:val="Strong"/>
+        </w:rPr>
+        <w:t>FN:</w:t>
+      </w:r>
+      <w:r>
+        <w:br/>
+        <w:t>Frequent handovers were missed. Signaling overhead and throughput interruptions may continue unresolved.</w:t>
+      </w:r>
+    </w:p>
+    <w:p>
+      <w:pPr>
+        <w:pStyle w:val="NormalWeb"/>
+        <w:numPr>
+          <w:ilvl w:val="0"/>
+          <w:numId w:val="76"/>
+        </w:numPr>
+      </w:pPr>
+      <w:r>
+        <w:rPr>
+          <w:rStyle w:val="Strong"/>
+        </w:rPr>
+        <w:t>TN:</w:t>
+      </w:r>
+      <w:r>
+        <w:br/>
+        <w:t>Handover instability was not the issue and correctly ruled out.</w:t>
+      </w:r>
+    </w:p>
+    <w:p>
+      <w:r>
+        <w:rPr>
+          <w:noProof/>
+        </w:rPr>
+        <w:pict w14:anchorId="1B1AD920">
+          <v:rect id="_x0000_i1027" alt="" style="width:468pt;height:.05pt;mso-width-percent:0;mso-height-percent:0;mso-width-percent:0;mso-height-percent:0" o:hralign="center" o:hrstd="t" o:hr="t" fillcolor="#a0a0a0" stroked="f"/>
+        </w:pict>
+      </w:r>
+    </w:p>
+    <w:p>
+      <w:pPr>
+        <w:pStyle w:val="Heading3"/>
+      </w:pPr>
+      <w:r>
+        <w:t>C6: PCI mod 30 conflict causing interference</w:t>
+      </w:r>
+    </w:p>
+    <w:p>
+      <w:pPr>
+        <w:pStyle w:val="NormalWeb"/>
+        <w:numPr>
+          <w:ilvl w:val="0"/>
+          <w:numId w:val="77"/>
+        </w:numPr>
+      </w:pPr>
+      <w:r>
+        <w:rPr>
+          <w:rStyle w:val="Strong"/>
+        </w:rPr>
+        <w:t>TP:</w:t>
+      </w:r>
+      <w:r>
+        <w:br/>
+        <w:t>PCI conflict/interference truly existed and was correctly detected. Engineers can optimize PCI planning.</w:t>
+      </w:r>
+    </w:p>
+    <w:p>
+      <w:pPr>
+        <w:pStyle w:val="NormalWeb"/>
+        <w:numPr>
+          <w:ilvl w:val="0"/>
+          <w:numId w:val="77"/>
+        </w:numPr>
+      </w:pPr>
+      <w:r>
+        <w:rPr>
+          <w:rStyle w:val="Strong"/>
+        </w:rPr>
+        <w:lastRenderedPageBreak/>
+        <w:t>FP:</w:t>
+      </w:r>
+      <w:r>
+        <w:br/>
+        <w:t>PCI conflict was not present, but engineers may unnecessarily investigate PCI configuration.</w:t>
+      </w:r>
+    </w:p>
+    <w:p>
+      <w:pPr>
+        <w:pStyle w:val="NormalWeb"/>
+        <w:numPr>
+          <w:ilvl w:val="0"/>
+          <w:numId w:val="77"/>
+        </w:numPr>
+      </w:pPr>
+      <w:r>
+        <w:rPr>
+          <w:rStyle w:val="Strong"/>
+        </w:rPr>
+        <w:t>FN:</w:t>
+      </w:r>
+      <w:r>
+        <w:br/>
+        <w:t>PCI conflict existed but was missed. Interference and mobility degradation may continue unresolved.</w:t>
+      </w:r>
+    </w:p>
+    <w:p>
+      <w:pPr>
+        <w:pStyle w:val="NormalWeb"/>
+        <w:numPr>
+          <w:ilvl w:val="0"/>
+          <w:numId w:val="77"/>
+        </w:numPr>
+      </w:pPr>
+      <w:r>
+        <w:rPr>
+          <w:rStyle w:val="Strong"/>
+        </w:rPr>
+        <w:t>TN:</w:t>
+      </w:r>
+      <w:r>
+        <w:br/>
+        <w:t>No PCI conflict existed and the model correctly ruled out C6.</w:t>
+      </w:r>
+    </w:p>
+    <w:p>
+      <w:r>
+        <w:rPr>
+          <w:noProof/>
+        </w:rPr>
+        <w:pict w14:anchorId="4816DCAD">
+          <v:rect id="_x0000_i1026" alt="" style="width:468pt;height:.05pt;mso-width-percent:0;mso-height-percent:0;mso-width-percent:0;mso-height-percent:0" o:hralign="center" o:hrstd="t" o:hr="t" fillcolor="#a0a0a0" stroked="f"/>
+        </w:pict>
+      </w:r>
+    </w:p>
+    <w:p>
+      <w:pPr>
+        <w:pStyle w:val="Heading3"/>
+      </w:pPr>
+      <w:r>
+        <w:t>C7: High vehicle speed (&gt;40 km/h) impacting throughput</w:t>
+      </w:r>
+    </w:p>
+    <w:p>
+      <w:pPr>
+        <w:pStyle w:val="NormalWeb"/>
+        <w:numPr>
+          <w:ilvl w:val="0"/>
+          <w:numId w:val="78"/>
+        </w:numPr>
+      </w:pPr>
+      <w:r>
+        <w:rPr>
+          <w:rStyle w:val="Strong"/>
+        </w:rPr>
+        <w:t>TP:</w:t>
+      </w:r>
+      <w:r>
+        <w:br/>
+        <w:t>Throughput degradation was truly caused by mobility speed and correctly identified.</w:t>
+      </w:r>
+    </w:p>
+    <w:p>
+      <w:pPr>
+        <w:pStyle w:val="NormalWeb"/>
+        <w:numPr>
+          <w:ilvl w:val="0"/>
+          <w:numId w:val="78"/>
+        </w:numPr>
+      </w:pPr>
+      <w:r>
+        <w:rPr>
+          <w:rStyle w:val="Strong"/>
+        </w:rPr>
+        <w:t>FP:</w:t>
+      </w:r>
+      <w:r>
+        <w:br/>
+        <w:t>High-speed mobility was incorrectly blamed, potentially delaying investigation of the real network issue.</w:t>
+      </w:r>
+    </w:p>
+    <w:p>
+      <w:pPr>
+        <w:pStyle w:val="NormalWeb"/>
+        <w:numPr>
+          <w:ilvl w:val="0"/>
+          <w:numId w:val="78"/>
+        </w:numPr>
+      </w:pPr>
+      <w:r>
+        <w:rPr>
+          <w:rStyle w:val="Strong"/>
+        </w:rPr>
+        <w:t>FN:</w:t>
+      </w:r>
+      <w:r>
+        <w:br/>
+        <w:t>Speed-related degradation was missed. However, operational impact may be lower since this issue is partially environment-driven and less controllable.</w:t>
+      </w:r>
+    </w:p>
+    <w:p>
+      <w:pPr>
+        <w:pStyle w:val="NormalWeb"/>
+        <w:numPr>
+          <w:ilvl w:val="0"/>
+          <w:numId w:val="78"/>
+        </w:numPr>
+      </w:pPr>
+      <w:r>
+        <w:rPr>
+          <w:rStyle w:val="Strong"/>
+        </w:rPr>
+        <w:t>TN:</w:t>
+      </w:r>
+      <w:r>
+        <w:br/>
+        <w:t>High vehicle speed was not the issue and correctly rejected.</w:t>
+      </w:r>
+    </w:p>
+    <w:p>
+      <w:r>
+        <w:rPr>
+          <w:noProof/>
+        </w:rPr>
+        <w:pict w14:anchorId="06CF9135">
+          <v:rect id="_x0000_i1025" alt="" style="width:468pt;height:.05pt;mso-width-percent:0;mso-height-percent:0;mso-width-percent:0;mso-height-percent:0" o:hralign="center" o:hrstd="t" o:hr="t" fillcolor="#a0a0a0" stroked="f"/>
+        </w:pict>
+      </w:r>
+    </w:p>
+    <w:p>
+      <w:pPr>
+        <w:pStyle w:val="Heading3"/>
+      </w:pPr>
+      <w:r>
+        <w:t>C8: Insufficient scheduled RBs (&lt;160) limiting throughput</w:t>
+      </w:r>
+    </w:p>
+    <w:p>
+      <w:pPr>
+        <w:pStyle w:val="NormalWeb"/>
+        <w:numPr>
+          <w:ilvl w:val="0"/>
+          <w:numId w:val="79"/>
+        </w:numPr>
+      </w:pPr>
+      <w:r>
+        <w:rPr>
+          <w:rStyle w:val="Strong"/>
+        </w:rPr>
+        <w:t>TP:</w:t>
+      </w:r>
+      <w:r>
+        <w:br/>
+        <w:t>Insufficient RB allocation was correctly identified. Engineers can optimize scheduler or capacity allocation.</w:t>
+      </w:r>
+    </w:p>
+    <w:p>
+      <w:pPr>
+        <w:pStyle w:val="NormalWeb"/>
+        <w:numPr>
+          <w:ilvl w:val="0"/>
+          <w:numId w:val="79"/>
+        </w:numPr>
+      </w:pPr>
+      <w:r>
+        <w:rPr>
+          <w:rStyle w:val="Strong"/>
+        </w:rPr>
+        <w:t>FP:</w:t>
+      </w:r>
+      <w:r>
+        <w:br/>
+        <w:t>Capacity limitation was incorrectly predicted, potentially leading to unnecessary scheduling optimization.</w:t>
+      </w:r>
+    </w:p>
+    <w:p>
+      <w:pPr>
+        <w:pStyle w:val="NormalWeb"/>
+        <w:numPr>
+          <w:ilvl w:val="0"/>
+          <w:numId w:val="79"/>
+        </w:numPr>
+      </w:pPr>
+      <w:r>
+        <w:rPr>
+          <w:rStyle w:val="Strong"/>
+        </w:rPr>
+        <w:t>FN:</w:t>
+      </w:r>
+      <w:r>
+        <w:br/>
+        <w:t>Resource block shortage existed but was missed. Throughput degradation and congestion may continue affecting users.</w:t>
+      </w:r>
+    </w:p>
+    <w:p>
+      <w:pPr>
+        <w:pStyle w:val="NormalWeb"/>
+        <w:numPr>
+          <w:ilvl w:val="0"/>
+          <w:numId w:val="79"/>
+        </w:numPr>
+      </w:pPr>
+      <w:r>
+        <w:rPr>
+          <w:rStyle w:val="Strong"/>
+        </w:rPr>
+        <w:t>TN:</w:t>
+      </w:r>
+      <w:r>
+        <w:br/>
+        <w:t>RB limitation was not the issue and correctly ruled out.</w:t>
+      </w:r>
+    </w:p>
+    <w:p>
+      <w:r>
+        <w:br w:type="page"/>
+      </w:r>
+    </w:p>
     <w:p>
       <w:pPr>
         <w:pStyle w:val="Compact"/>
@@ -5039,6 +5802,155 @@
     </w:lvl>
   </w:abstractNum>
   <w:abstractNum w:abstractNumId="5" w15:restartNumberingAfterBreak="0">
+    <w:nsid w:val="18047A62"/>
+    <w:multiLevelType w:val="multilevel"/>
+    <w:tmpl w:val="CC8A4A36"/>
+    <w:lvl w:ilvl="0">
+      <w:start w:val="1"/>
+      <w:numFmt w:val="bullet"/>
+      <w:lvlText w:val=""/>
+      <w:lvlJc w:val="left"/>
+      <w:pPr>
+        <w:tabs>
+          <w:tab w:val="num" w:pos="720"/>
+        </w:tabs>
+        <w:ind w:left="720" w:hanging="360"/>
+      </w:pPr>
+      <w:rPr>
+        <w:rFonts w:ascii="Symbol" w:hAnsi="Symbol" w:hint="default"/>
+        <w:sz w:val="20"/>
+      </w:rPr>
+    </w:lvl>
+    <w:lvl w:ilvl="1" w:tentative="1">
+      <w:start w:val="1"/>
+      <w:numFmt w:val="bullet"/>
+      <w:lvlText w:val="o"/>
+      <w:lvlJc w:val="left"/>
+      <w:pPr>
+        <w:tabs>
+          <w:tab w:val="num" w:pos="1440"/>
+        </w:tabs>
+        <w:ind w:left="1440" w:hanging="360"/>
+      </w:pPr>
+      <w:rPr>
+        <w:rFonts w:ascii="Courier New" w:hAnsi="Courier New" w:hint="default"/>
+        <w:sz w:val="20"/>
+      </w:rPr>
+    </w:lvl>
+    <w:lvl w:ilvl="2" w:tentative="1">
+      <w:start w:val="1"/>
+      <w:numFmt w:val="bullet"/>
+      <w:lvlText w:val=""/>
+      <w:lvlJc w:val="left"/>
+      <w:pPr>
+        <w:tabs>
+          <w:tab w:val="num" w:pos="2160"/>
+        </w:tabs>
+        <w:ind w:left="2160" w:hanging="360"/>
+      </w:pPr>
+      <w:rPr>
+        <w:rFonts w:ascii="Wingdings" w:hAnsi="Wingdings" w:hint="default"/>
+        <w:sz w:val="20"/>
+      </w:rPr>
+    </w:lvl>
+    <w:lvl w:ilvl="3" w:tentative="1">
+      <w:start w:val="1"/>
+      <w:numFmt w:val="bullet"/>
+      <w:lvlText w:val=""/>
+      <w:lvlJc w:val="left"/>
+      <w:pPr>
+        <w:tabs>
+          <w:tab w:val="num" w:pos="2880"/>
+        </w:tabs>
+        <w:ind w:left="2880" w:hanging="360"/>
+      </w:pPr>
+      <w:rPr>
+        <w:rFonts w:ascii="Wingdings" w:hAnsi="Wingdings" w:hint="default"/>
+        <w:sz w:val="20"/>
+      </w:rPr>
+    </w:lvl>
+    <w:lvl w:ilvl="4" w:tentative="1">
+      <w:start w:val="1"/>
+      <w:numFmt w:val="bullet"/>
+      <w:lvlText w:val=""/>
+      <w:lvlJc w:val="left"/>
+      <w:pPr>
+        <w:tabs>
+          <w:tab w:val="num" w:pos="3600"/>
+        </w:tabs>
+        <w:ind w:left="3600" w:hanging="360"/>
+      </w:pPr>
+      <w:rPr>
+        <w:rFonts w:ascii="Wingdings" w:hAnsi="Wingdings" w:hint="default"/>
+        <w:sz w:val="20"/>
+      </w:rPr>
+    </w:lvl>
+    <w:lvl w:ilvl="5" w:tentative="1">
+      <w:start w:val="1"/>
+      <w:numFmt w:val="bullet"/>
+      <w:lvlText w:val=""/>
+      <w:lvlJc w:val="left"/>
+      <w:pPr>
+        <w:tabs>
+          <w:tab w:val="num" w:pos="4320"/>
+        </w:tabs>
+        <w:ind w:left="4320" w:hanging="360"/>
+      </w:pPr>
+      <w:rPr>
+        <w:rFonts w:ascii="Wingdings" w:hAnsi="Wingdings" w:hint="default"/>
+        <w:sz w:val="20"/>
+      </w:rPr>
+    </w:lvl>
+    <w:lvl w:ilvl="6" w:tentative="1">
+      <w:start w:val="1"/>
+      <w:numFmt w:val="bullet"/>
+      <w:lvlText w:val=""/>
+      <w:lvlJc w:val="left"/>
+      <w:pPr>
+        <w:tabs>
+          <w:tab w:val="num" w:pos="5040"/>
+        </w:tabs>
+        <w:ind w:left="5040" w:hanging="360"/>
+      </w:pPr>
+      <w:rPr>
+        <w:rFonts w:ascii="Wingdings" w:hAnsi="Wingdings" w:hint="default"/>
+        <w:sz w:val="20"/>
+      </w:rPr>
+    </w:lvl>
+    <w:lvl w:ilvl="7" w:tentative="1">
+      <w:start w:val="1"/>
+      <w:numFmt w:val="bullet"/>
+      <w:lvlText w:val=""/>
+      <w:lvlJc w:val="left"/>
+      <w:pPr>
+        <w:tabs>
+          <w:tab w:val="num" w:pos="5760"/>
+        </w:tabs>
+        <w:ind w:left="5760" w:hanging="360"/>
+      </w:pPr>
+      <w:rPr>
+        <w:rFonts w:ascii="Wingdings" w:hAnsi="Wingdings" w:hint="default"/>
+        <w:sz w:val="20"/>
+      </w:rPr>
+    </w:lvl>
+    <w:lvl w:ilvl="8" w:tentative="1">
+      <w:start w:val="1"/>
+      <w:numFmt w:val="bullet"/>
+      <w:lvlText w:val=""/>
+      <w:lvlJc w:val="left"/>
+      <w:pPr>
+        <w:tabs>
+          <w:tab w:val="num" w:pos="6480"/>
+        </w:tabs>
+        <w:ind w:left="6480" w:hanging="360"/>
+      </w:pPr>
+      <w:rPr>
+        <w:rFonts w:ascii="Wingdings" w:hAnsi="Wingdings" w:hint="default"/>
+        <w:sz w:val="20"/>
+      </w:rPr>
+    </w:lvl>
+  </w:abstractNum>
+  <w:abstractNum w:abstractNumId="6" w15:restartNumberingAfterBreak="0">
     <w:nsid w:val="1B0F5719"/>
     <w:multiLevelType w:val="multilevel"/>
     <w:tmpl w:val="4B0C6926"/>
@@ -5187,7 +6099,7 @@
       </w:rPr>
     </w:lvl>
   </w:abstractNum>
-  <w:abstractNum w:abstractNumId="6" w15:restartNumberingAfterBreak="0">
+  <w:abstractNum w:abstractNumId="7" w15:restartNumberingAfterBreak="0">
     <w:nsid w:val="2356514D"/>
     <w:multiLevelType w:val="multilevel"/>
     <w:tmpl w:val="572EEB98"/>
@@ -5336,7 +6248,7 @@
       </w:rPr>
     </w:lvl>
   </w:abstractNum>
-  <w:abstractNum w:abstractNumId="7" w15:restartNumberingAfterBreak="0">
+  <w:abstractNum w:abstractNumId="8" w15:restartNumberingAfterBreak="0">
     <w:nsid w:val="279775B5"/>
     <w:multiLevelType w:val="multilevel"/>
     <w:tmpl w:val="0674EAEC"/>
@@ -5485,7 +6397,7 @@
       </w:rPr>
     </w:lvl>
   </w:abstractNum>
-  <w:abstractNum w:abstractNumId="8" w15:restartNumberingAfterBreak="0">
+  <w:abstractNum w:abstractNumId="9" w15:restartNumberingAfterBreak="0">
     <w:nsid w:val="281E51DD"/>
     <w:multiLevelType w:val="multilevel"/>
     <w:tmpl w:val="B32C480A"/>
@@ -5634,7 +6546,156 @@
       </w:rPr>
     </w:lvl>
   </w:abstractNum>
-  <w:abstractNum w:abstractNumId="9" w15:restartNumberingAfterBreak="0">
+  <w:abstractNum w:abstractNumId="10" w15:restartNumberingAfterBreak="0">
+    <w:nsid w:val="29F72BED"/>
+    <w:multiLevelType w:val="multilevel"/>
+    <w:tmpl w:val="AD16A4D8"/>
+    <w:lvl w:ilvl="0">
+      <w:start w:val="1"/>
+      <w:numFmt w:val="bullet"/>
+      <w:lvlText w:val=""/>
+      <w:lvlJc w:val="left"/>
+      <w:pPr>
+        <w:tabs>
+          <w:tab w:val="num" w:pos="720"/>
+        </w:tabs>
+        <w:ind w:left="720" w:hanging="360"/>
+      </w:pPr>
+      <w:rPr>
+        <w:rFonts w:ascii="Symbol" w:hAnsi="Symbol" w:hint="default"/>
+        <w:sz w:val="20"/>
+      </w:rPr>
+    </w:lvl>
+    <w:lvl w:ilvl="1" w:tentative="1">
+      <w:start w:val="1"/>
+      <w:numFmt w:val="bullet"/>
+      <w:lvlText w:val="o"/>
+      <w:lvlJc w:val="left"/>
+      <w:pPr>
+        <w:tabs>
+          <w:tab w:val="num" w:pos="1440"/>
+        </w:tabs>
+        <w:ind w:left="1440" w:hanging="360"/>
+      </w:pPr>
+      <w:rPr>
+        <w:rFonts w:ascii="Courier New" w:hAnsi="Courier New" w:hint="default"/>
+        <w:sz w:val="20"/>
+      </w:rPr>
+    </w:lvl>
+    <w:lvl w:ilvl="2" w:tentative="1">
+      <w:start w:val="1"/>
+      <w:numFmt w:val="bullet"/>
+      <w:lvlText w:val=""/>
+      <w:lvlJc w:val="left"/>
+      <w:pPr>
+        <w:tabs>
+          <w:tab w:val="num" w:pos="2160"/>
+        </w:tabs>
+        <w:ind w:left="2160" w:hanging="360"/>
+      </w:pPr>
+      <w:rPr>
+        <w:rFonts w:ascii="Wingdings" w:hAnsi="Wingdings" w:hint="default"/>
+        <w:sz w:val="20"/>
+      </w:rPr>
+    </w:lvl>
+    <w:lvl w:ilvl="3" w:tentative="1">
+      <w:start w:val="1"/>
+      <w:numFmt w:val="bullet"/>
+      <w:lvlText w:val=""/>
+      <w:lvlJc w:val="left"/>
+      <w:pPr>
+        <w:tabs>
+          <w:tab w:val="num" w:pos="2880"/>
+        </w:tabs>
+        <w:ind w:left="2880" w:hanging="360"/>
+      </w:pPr>
+      <w:rPr>
+        <w:rFonts w:ascii="Wingdings" w:hAnsi="Wingdings" w:hint="default"/>
+        <w:sz w:val="20"/>
+      </w:rPr>
+    </w:lvl>
+    <w:lvl w:ilvl="4" w:tentative="1">
+      <w:start w:val="1"/>
+      <w:numFmt w:val="bullet"/>
+      <w:lvlText w:val=""/>
+      <w:lvlJc w:val="left"/>
+      <w:pPr>
+        <w:tabs>
+          <w:tab w:val="num" w:pos="3600"/>
+        </w:tabs>
+        <w:ind w:left="3600" w:hanging="360"/>
+      </w:pPr>
+      <w:rPr>
+        <w:rFonts w:ascii="Wingdings" w:hAnsi="Wingdings" w:hint="default"/>
+        <w:sz w:val="20"/>
+      </w:rPr>
+    </w:lvl>
+    <w:lvl w:ilvl="5" w:tentative="1">
+      <w:start w:val="1"/>
+      <w:numFmt w:val="bullet"/>
+      <w:lvlText w:val=""/>
+      <w:lvlJc w:val="left"/>
+      <w:pPr>
+        <w:tabs>
+          <w:tab w:val="num" w:pos="4320"/>
+        </w:tabs>
+        <w:ind w:left="4320" w:hanging="360"/>
+      </w:pPr>
+      <w:rPr>
+        <w:rFonts w:ascii="Wingdings" w:hAnsi="Wingdings" w:hint="default"/>
+        <w:sz w:val="20"/>
+      </w:rPr>
+    </w:lvl>
+    <w:lvl w:ilvl="6" w:tentative="1">
+      <w:start w:val="1"/>
+      <w:numFmt w:val="bullet"/>
+      <w:lvlText w:val=""/>
+      <w:lvlJc w:val="left"/>
+      <w:pPr>
+        <w:tabs>
+          <w:tab w:val="num" w:pos="5040"/>
+        </w:tabs>
+        <w:ind w:left="5040" w:hanging="360"/>
+      </w:pPr>
+      <w:rPr>
+        <w:rFonts w:ascii="Wingdings" w:hAnsi="Wingdings" w:hint="default"/>
+        <w:sz w:val="20"/>
+      </w:rPr>
+    </w:lvl>
+    <w:lvl w:ilvl="7" w:tentative="1">
+      <w:start w:val="1"/>
+      <w:numFmt w:val="bullet"/>
+      <w:lvlText w:val=""/>
+      <w:lvlJc w:val="left"/>
+      <w:pPr>
+        <w:tabs>
+          <w:tab w:val="num" w:pos="5760"/>
+        </w:tabs>
+        <w:ind w:left="5760" w:hanging="360"/>
+      </w:pPr>
+      <w:rPr>
+        <w:rFonts w:ascii="Wingdings" w:hAnsi="Wingdings" w:hint="default"/>
+        <w:sz w:val="20"/>
+      </w:rPr>
+    </w:lvl>
+    <w:lvl w:ilvl="8" w:tentative="1">
+      <w:start w:val="1"/>
+      <w:numFmt w:val="bullet"/>
+      <w:lvlText w:val=""/>
+      <w:lvlJc w:val="left"/>
+      <w:pPr>
+        <w:tabs>
+          <w:tab w:val="num" w:pos="6480"/>
+        </w:tabs>
+        <w:ind w:left="6480" w:hanging="360"/>
+      </w:pPr>
+      <w:rPr>
+        <w:rFonts w:ascii="Wingdings" w:hAnsi="Wingdings" w:hint="default"/>
+        <w:sz w:val="20"/>
+      </w:rPr>
+    </w:lvl>
+  </w:abstractNum>
+  <w:abstractNum w:abstractNumId="11" w15:restartNumberingAfterBreak="0">
     <w:nsid w:val="2DCE04A6"/>
     <w:multiLevelType w:val="multilevel"/>
     <w:tmpl w:val="0292D8F2"/>
@@ -5783,7 +6844,156 @@
       </w:rPr>
     </w:lvl>
   </w:abstractNum>
-  <w:abstractNum w:abstractNumId="10" w15:restartNumberingAfterBreak="0">
+  <w:abstractNum w:abstractNumId="12" w15:restartNumberingAfterBreak="0">
+    <w:nsid w:val="2E506617"/>
+    <w:multiLevelType w:val="multilevel"/>
+    <w:tmpl w:val="7F0EAFA4"/>
+    <w:lvl w:ilvl="0">
+      <w:start w:val="1"/>
+      <w:numFmt w:val="bullet"/>
+      <w:lvlText w:val=""/>
+      <w:lvlJc w:val="left"/>
+      <w:pPr>
+        <w:tabs>
+          <w:tab w:val="num" w:pos="720"/>
+        </w:tabs>
+        <w:ind w:left="720" w:hanging="360"/>
+      </w:pPr>
+      <w:rPr>
+        <w:rFonts w:ascii="Symbol" w:hAnsi="Symbol" w:hint="default"/>
+        <w:sz w:val="20"/>
+      </w:rPr>
+    </w:lvl>
+    <w:lvl w:ilvl="1" w:tentative="1">
+      <w:start w:val="1"/>
+      <w:numFmt w:val="bullet"/>
+      <w:lvlText w:val="o"/>
+      <w:lvlJc w:val="left"/>
+      <w:pPr>
+        <w:tabs>
+          <w:tab w:val="num" w:pos="1440"/>
+        </w:tabs>
+        <w:ind w:left="1440" w:hanging="360"/>
+      </w:pPr>
+      <w:rPr>
+        <w:rFonts w:ascii="Courier New" w:hAnsi="Courier New" w:hint="default"/>
+        <w:sz w:val="20"/>
+      </w:rPr>
+    </w:lvl>
+    <w:lvl w:ilvl="2" w:tentative="1">
+      <w:start w:val="1"/>
+      <w:numFmt w:val="bullet"/>
+      <w:lvlText w:val=""/>
+      <w:lvlJc w:val="left"/>
+      <w:pPr>
+        <w:tabs>
+          <w:tab w:val="num" w:pos="2160"/>
+        </w:tabs>
+        <w:ind w:left="2160" w:hanging="360"/>
+      </w:pPr>
+      <w:rPr>
+        <w:rFonts w:ascii="Wingdings" w:hAnsi="Wingdings" w:hint="default"/>
+        <w:sz w:val="20"/>
+      </w:rPr>
+    </w:lvl>
+    <w:lvl w:ilvl="3" w:tentative="1">
+      <w:start w:val="1"/>
+      <w:numFmt w:val="bullet"/>
+      <w:lvlText w:val=""/>
+      <w:lvlJc w:val="left"/>
+      <w:pPr>
+        <w:tabs>
+          <w:tab w:val="num" w:pos="2880"/>
+        </w:tabs>
+        <w:ind w:left="2880" w:hanging="360"/>
+      </w:pPr>
+      <w:rPr>
+        <w:rFonts w:ascii="Wingdings" w:hAnsi="Wingdings" w:hint="default"/>
+        <w:sz w:val="20"/>
+      </w:rPr>
+    </w:lvl>
+    <w:lvl w:ilvl="4" w:tentative="1">
+      <w:start w:val="1"/>
+      <w:numFmt w:val="bullet"/>
+      <w:lvlText w:val=""/>
+      <w:lvlJc w:val="left"/>
+      <w:pPr>
+        <w:tabs>
+          <w:tab w:val="num" w:pos="3600"/>
+        </w:tabs>
+        <w:ind w:left="3600" w:hanging="360"/>
+      </w:pPr>
+      <w:rPr>
+        <w:rFonts w:ascii="Wingdings" w:hAnsi="Wingdings" w:hint="default"/>
+        <w:sz w:val="20"/>
+      </w:rPr>
+    </w:lvl>
+    <w:lvl w:ilvl="5" w:tentative="1">
+      <w:start w:val="1"/>
+      <w:numFmt w:val="bullet"/>
+      <w:lvlText w:val=""/>
+      <w:lvlJc w:val="left"/>
+      <w:pPr>
+        <w:tabs>
+          <w:tab w:val="num" w:pos="4320"/>
+        </w:tabs>
+        <w:ind w:left="4320" w:hanging="360"/>
+      </w:pPr>
+      <w:rPr>
+        <w:rFonts w:ascii="Wingdings" w:hAnsi="Wingdings" w:hint="default"/>
+        <w:sz w:val="20"/>
+      </w:rPr>
+    </w:lvl>
+    <w:lvl w:ilvl="6" w:tentative="1">
+      <w:start w:val="1"/>
+      <w:numFmt w:val="bullet"/>
+      <w:lvlText w:val=""/>
+      <w:lvlJc w:val="left"/>
+      <w:pPr>
+        <w:tabs>
+          <w:tab w:val="num" w:pos="5040"/>
+        </w:tabs>
+        <w:ind w:left="5040" w:hanging="360"/>
+      </w:pPr>
+      <w:rPr>
+        <w:rFonts w:ascii="Wingdings" w:hAnsi="Wingdings" w:hint="default"/>
+        <w:sz w:val="20"/>
+      </w:rPr>
+    </w:lvl>
+    <w:lvl w:ilvl="7" w:tentative="1">
+      <w:start w:val="1"/>
+      <w:numFmt w:val="bullet"/>
+      <w:lvlText w:val=""/>
+      <w:lvlJc w:val="left"/>
+      <w:pPr>
+        <w:tabs>
+          <w:tab w:val="num" w:pos="5760"/>
+        </w:tabs>
+        <w:ind w:left="5760" w:hanging="360"/>
+      </w:pPr>
+      <w:rPr>
+        <w:rFonts w:ascii="Wingdings" w:hAnsi="Wingdings" w:hint="default"/>
+        <w:sz w:val="20"/>
+      </w:rPr>
+    </w:lvl>
+    <w:lvl w:ilvl="8" w:tentative="1">
+      <w:start w:val="1"/>
+      <w:numFmt w:val="bullet"/>
+      <w:lvlText w:val=""/>
+      <w:lvlJc w:val="left"/>
+      <w:pPr>
+        <w:tabs>
+          <w:tab w:val="num" w:pos="6480"/>
+        </w:tabs>
+        <w:ind w:left="6480" w:hanging="360"/>
+      </w:pPr>
+      <w:rPr>
+        <w:rFonts w:ascii="Wingdings" w:hAnsi="Wingdings" w:hint="default"/>
+        <w:sz w:val="20"/>
+      </w:rPr>
+    </w:lvl>
+  </w:abstractNum>
+  <w:abstractNum w:abstractNumId="13" w15:restartNumberingAfterBreak="0">
     <w:nsid w:val="32996354"/>
     <w:multiLevelType w:val="multilevel"/>
     <w:tmpl w:val="8D64D4E2"/>
@@ -5932,7 +7142,7 @@
       </w:rPr>
     </w:lvl>
   </w:abstractNum>
-  <w:abstractNum w:abstractNumId="11" w15:restartNumberingAfterBreak="0">
+  <w:abstractNum w:abstractNumId="14" w15:restartNumberingAfterBreak="0">
     <w:nsid w:val="42102E05"/>
     <w:multiLevelType w:val="multilevel"/>
     <w:tmpl w:val="58CE45A8"/>
@@ -6081,7 +7291,454 @@
       </w:rPr>
     </w:lvl>
   </w:abstractNum>
-  <w:abstractNum w:abstractNumId="12" w15:restartNumberingAfterBreak="0">
+  <w:abstractNum w:abstractNumId="15" w15:restartNumberingAfterBreak="0">
+    <w:nsid w:val="463943D9"/>
+    <w:multiLevelType w:val="multilevel"/>
+    <w:tmpl w:val="244846BE"/>
+    <w:lvl w:ilvl="0">
+      <w:start w:val="1"/>
+      <w:numFmt w:val="bullet"/>
+      <w:lvlText w:val=""/>
+      <w:lvlJc w:val="left"/>
+      <w:pPr>
+        <w:tabs>
+          <w:tab w:val="num" w:pos="720"/>
+        </w:tabs>
+        <w:ind w:left="720" w:hanging="360"/>
+      </w:pPr>
+      <w:rPr>
+        <w:rFonts w:ascii="Symbol" w:hAnsi="Symbol" w:hint="default"/>
+        <w:sz w:val="20"/>
+      </w:rPr>
+    </w:lvl>
+    <w:lvl w:ilvl="1" w:tentative="1">
+      <w:start w:val="1"/>
+      <w:numFmt w:val="bullet"/>
+      <w:lvlText w:val="o"/>
+      <w:lvlJc w:val="left"/>
+      <w:pPr>
+        <w:tabs>
+          <w:tab w:val="num" w:pos="1440"/>
+        </w:tabs>
+        <w:ind w:left="1440" w:hanging="360"/>
+      </w:pPr>
+      <w:rPr>
+        <w:rFonts w:ascii="Courier New" w:hAnsi="Courier New" w:hint="default"/>
+        <w:sz w:val="20"/>
+      </w:rPr>
+    </w:lvl>
+    <w:lvl w:ilvl="2" w:tentative="1">
+      <w:start w:val="1"/>
+      <w:numFmt w:val="bullet"/>
+      <w:lvlText w:val=""/>
+      <w:lvlJc w:val="left"/>
+      <w:pPr>
+        <w:tabs>
+          <w:tab w:val="num" w:pos="2160"/>
+        </w:tabs>
+        <w:ind w:left="2160" w:hanging="360"/>
+      </w:pPr>
+      <w:rPr>
+        <w:rFonts w:ascii="Wingdings" w:hAnsi="Wingdings" w:hint="default"/>
+        <w:sz w:val="20"/>
+      </w:rPr>
+    </w:lvl>
+    <w:lvl w:ilvl="3" w:tentative="1">
+      <w:start w:val="1"/>
+      <w:numFmt w:val="bullet"/>
+      <w:lvlText w:val=""/>
+      <w:lvlJc w:val="left"/>
+      <w:pPr>
+        <w:tabs>
+          <w:tab w:val="num" w:pos="2880"/>
+        </w:tabs>
+        <w:ind w:left="2880" w:hanging="360"/>
+      </w:pPr>
+      <w:rPr>
+        <w:rFonts w:ascii="Wingdings" w:hAnsi="Wingdings" w:hint="default"/>
+        <w:sz w:val="20"/>
+      </w:rPr>
+    </w:lvl>
+    <w:lvl w:ilvl="4" w:tentative="1">
+      <w:start w:val="1"/>
+      <w:numFmt w:val="bullet"/>
+      <w:lvlText w:val=""/>
+      <w:lvlJc w:val="left"/>
+      <w:pPr>
+        <w:tabs>
+          <w:tab w:val="num" w:pos="3600"/>
+        </w:tabs>
+        <w:ind w:left="3600" w:hanging="360"/>
+      </w:pPr>
+      <w:rPr>
+        <w:rFonts w:ascii="Wingdings" w:hAnsi="Wingdings" w:hint="default"/>
+        <w:sz w:val="20"/>
+      </w:rPr>
+    </w:lvl>
+    <w:lvl w:ilvl="5" w:tentative="1">
+      <w:start w:val="1"/>
+      <w:numFmt w:val="bullet"/>
+      <w:lvlText w:val=""/>
+      <w:lvlJc w:val="left"/>
+      <w:pPr>
+        <w:tabs>
+          <w:tab w:val="num" w:pos="4320"/>
+        </w:tabs>
+        <w:ind w:left="4320" w:hanging="360"/>
+      </w:pPr>
+      <w:rPr>
+        <w:rFonts w:ascii="Wingdings" w:hAnsi="Wingdings" w:hint="default"/>
+        <w:sz w:val="20"/>
+      </w:rPr>
+    </w:lvl>
+    <w:lvl w:ilvl="6" w:tentative="1">
+      <w:start w:val="1"/>
+      <w:numFmt w:val="bullet"/>
+      <w:lvlText w:val=""/>
+      <w:lvlJc w:val="left"/>
+      <w:pPr>
+        <w:tabs>
+          <w:tab w:val="num" w:pos="5040"/>
+        </w:tabs>
+        <w:ind w:left="5040" w:hanging="360"/>
+      </w:pPr>
+      <w:rPr>
+        <w:rFonts w:ascii="Wingdings" w:hAnsi="Wingdings" w:hint="default"/>
+        <w:sz w:val="20"/>
+      </w:rPr>
+    </w:lvl>
+    <w:lvl w:ilvl="7" w:tentative="1">
+      <w:start w:val="1"/>
+      <w:numFmt w:val="bullet"/>
+      <w:lvlText w:val=""/>
+      <w:lvlJc w:val="left"/>
+      <w:pPr>
+        <w:tabs>
+          <w:tab w:val="num" w:pos="5760"/>
+        </w:tabs>
+        <w:ind w:left="5760" w:hanging="360"/>
+      </w:pPr>
+      <w:rPr>
+        <w:rFonts w:ascii="Wingdings" w:hAnsi="Wingdings" w:hint="default"/>
+        <w:sz w:val="20"/>
+      </w:rPr>
+    </w:lvl>
+    <w:lvl w:ilvl="8" w:tentative="1">
+      <w:start w:val="1"/>
+      <w:numFmt w:val="bullet"/>
+      <w:lvlText w:val=""/>
+      <w:lvlJc w:val="left"/>
+      <w:pPr>
+        <w:tabs>
+          <w:tab w:val="num" w:pos="6480"/>
+        </w:tabs>
+        <w:ind w:left="6480" w:hanging="360"/>
+      </w:pPr>
+      <w:rPr>
+        <w:rFonts w:ascii="Wingdings" w:hAnsi="Wingdings" w:hint="default"/>
+        <w:sz w:val="20"/>
+      </w:rPr>
+    </w:lvl>
+  </w:abstractNum>
+  <w:abstractNum w:abstractNumId="16" w15:restartNumberingAfterBreak="0">
+    <w:nsid w:val="46C24406"/>
+    <w:multiLevelType w:val="multilevel"/>
+    <w:tmpl w:val="9C3C4770"/>
+    <w:lvl w:ilvl="0">
+      <w:start w:val="1"/>
+      <w:numFmt w:val="bullet"/>
+      <w:lvlText w:val=""/>
+      <w:lvlJc w:val="left"/>
+      <w:pPr>
+        <w:tabs>
+          <w:tab w:val="num" w:pos="720"/>
+        </w:tabs>
+        <w:ind w:left="720" w:hanging="360"/>
+      </w:pPr>
+      <w:rPr>
+        <w:rFonts w:ascii="Symbol" w:hAnsi="Symbol" w:hint="default"/>
+        <w:sz w:val="20"/>
+      </w:rPr>
+    </w:lvl>
+    <w:lvl w:ilvl="1" w:tentative="1">
+      <w:start w:val="1"/>
+      <w:numFmt w:val="bullet"/>
+      <w:lvlText w:val="o"/>
+      <w:lvlJc w:val="left"/>
+      <w:pPr>
+        <w:tabs>
+          <w:tab w:val="num" w:pos="1440"/>
+        </w:tabs>
+        <w:ind w:left="1440" w:hanging="360"/>
+      </w:pPr>
+      <w:rPr>
+        <w:rFonts w:ascii="Courier New" w:hAnsi="Courier New" w:hint="default"/>
+        <w:sz w:val="20"/>
+      </w:rPr>
+    </w:lvl>
+    <w:lvl w:ilvl="2" w:tentative="1">
+      <w:start w:val="1"/>
+      <w:numFmt w:val="bullet"/>
+      <w:lvlText w:val=""/>
+      <w:lvlJc w:val="left"/>
+      <w:pPr>
+        <w:tabs>
+          <w:tab w:val="num" w:pos="2160"/>
+        </w:tabs>
+        <w:ind w:left="2160" w:hanging="360"/>
+      </w:pPr>
+      <w:rPr>
+        <w:rFonts w:ascii="Wingdings" w:hAnsi="Wingdings" w:hint="default"/>
+        <w:sz w:val="20"/>
+      </w:rPr>
+    </w:lvl>
+    <w:lvl w:ilvl="3" w:tentative="1">
+      <w:start w:val="1"/>
+      <w:numFmt w:val="bullet"/>
+      <w:lvlText w:val=""/>
+      <w:lvlJc w:val="left"/>
+      <w:pPr>
+        <w:tabs>
+          <w:tab w:val="num" w:pos="2880"/>
+        </w:tabs>
+        <w:ind w:left="2880" w:hanging="360"/>
+      </w:pPr>
+      <w:rPr>
+        <w:rFonts w:ascii="Wingdings" w:hAnsi="Wingdings" w:hint="default"/>
+        <w:sz w:val="20"/>
+      </w:rPr>
+    </w:lvl>
+    <w:lvl w:ilvl="4" w:tentative="1">
+      <w:start w:val="1"/>
+      <w:numFmt w:val="bullet"/>
+      <w:lvlText w:val=""/>
+      <w:lvlJc w:val="left"/>
+      <w:pPr>
+        <w:tabs>
+          <w:tab w:val="num" w:pos="3600"/>
+        </w:tabs>
+        <w:ind w:left="3600" w:hanging="360"/>
+      </w:pPr>
+      <w:rPr>
+        <w:rFonts w:ascii="Wingdings" w:hAnsi="Wingdings" w:hint="default"/>
+        <w:sz w:val="20"/>
+      </w:rPr>
+    </w:lvl>
+    <w:lvl w:ilvl="5" w:tentative="1">
+      <w:start w:val="1"/>
+      <w:numFmt w:val="bullet"/>
+      <w:lvlText w:val=""/>
+      <w:lvlJc w:val="left"/>
+      <w:pPr>
+        <w:tabs>
+          <w:tab w:val="num" w:pos="4320"/>
+        </w:tabs>
+        <w:ind w:left="4320" w:hanging="360"/>
+      </w:pPr>
+      <w:rPr>
+        <w:rFonts w:ascii="Wingdings" w:hAnsi="Wingdings" w:hint="default"/>
+        <w:sz w:val="20"/>
+      </w:rPr>
+    </w:lvl>
+    <w:lvl w:ilvl="6" w:tentative="1">
+      <w:start w:val="1"/>
+      <w:numFmt w:val="bullet"/>
+      <w:lvlText w:val=""/>
+      <w:lvlJc w:val="left"/>
+      <w:pPr>
+        <w:tabs>
+          <w:tab w:val="num" w:pos="5040"/>
+        </w:tabs>
+        <w:ind w:left="5040" w:hanging="360"/>
+      </w:pPr>
+      <w:rPr>
+        <w:rFonts w:ascii="Wingdings" w:hAnsi="Wingdings" w:hint="default"/>
+        <w:sz w:val="20"/>
+      </w:rPr>
+    </w:lvl>
+    <w:lvl w:ilvl="7" w:tentative="1">
+      <w:start w:val="1"/>
+      <w:numFmt w:val="bullet"/>
+      <w:lvlText w:val=""/>
+      <w:lvlJc w:val="left"/>
+      <w:pPr>
+        <w:tabs>
+          <w:tab w:val="num" w:pos="5760"/>
+        </w:tabs>
+        <w:ind w:left="5760" w:hanging="360"/>
+      </w:pPr>
+      <w:rPr>
+        <w:rFonts w:ascii="Wingdings" w:hAnsi="Wingdings" w:hint="default"/>
+        <w:sz w:val="20"/>
+      </w:rPr>
+    </w:lvl>
+    <w:lvl w:ilvl="8" w:tentative="1">
+      <w:start w:val="1"/>
+      <w:numFmt w:val="bullet"/>
+      <w:lvlText w:val=""/>
+      <w:lvlJc w:val="left"/>
+      <w:pPr>
+        <w:tabs>
+          <w:tab w:val="num" w:pos="6480"/>
+        </w:tabs>
+        <w:ind w:left="6480" w:hanging="360"/>
+      </w:pPr>
+      <w:rPr>
+        <w:rFonts w:ascii="Wingdings" w:hAnsi="Wingdings" w:hint="default"/>
+        <w:sz w:val="20"/>
+      </w:rPr>
+    </w:lvl>
+  </w:abstractNum>
+  <w:abstractNum w:abstractNumId="17" w15:restartNumberingAfterBreak="0">
+    <w:nsid w:val="48971E2F"/>
+    <w:multiLevelType w:val="multilevel"/>
+    <w:tmpl w:val="39AA8A38"/>
+    <w:lvl w:ilvl="0">
+      <w:start w:val="1"/>
+      <w:numFmt w:val="bullet"/>
+      <w:lvlText w:val=""/>
+      <w:lvlJc w:val="left"/>
+      <w:pPr>
+        <w:tabs>
+          <w:tab w:val="num" w:pos="720"/>
+        </w:tabs>
+        <w:ind w:left="720" w:hanging="360"/>
+      </w:pPr>
+      <w:rPr>
+        <w:rFonts w:ascii="Symbol" w:hAnsi="Symbol" w:hint="default"/>
+        <w:sz w:val="20"/>
+      </w:rPr>
+    </w:lvl>
+    <w:lvl w:ilvl="1" w:tentative="1">
+      <w:start w:val="1"/>
+      <w:numFmt w:val="bullet"/>
+      <w:lvlText w:val="o"/>
+      <w:lvlJc w:val="left"/>
+      <w:pPr>
+        <w:tabs>
+          <w:tab w:val="num" w:pos="1440"/>
+        </w:tabs>
+        <w:ind w:left="1440" w:hanging="360"/>
+      </w:pPr>
+      <w:rPr>
+        <w:rFonts w:ascii="Courier New" w:hAnsi="Courier New" w:hint="default"/>
+        <w:sz w:val="20"/>
+      </w:rPr>
+    </w:lvl>
+    <w:lvl w:ilvl="2" w:tentative="1">
+      <w:start w:val="1"/>
+      <w:numFmt w:val="bullet"/>
+      <w:lvlText w:val=""/>
+      <w:lvlJc w:val="left"/>
+      <w:pPr>
+        <w:tabs>
+          <w:tab w:val="num" w:pos="2160"/>
+        </w:tabs>
+        <w:ind w:left="2160" w:hanging="360"/>
+      </w:pPr>
+      <w:rPr>
+        <w:rFonts w:ascii="Wingdings" w:hAnsi="Wingdings" w:hint="default"/>
+        <w:sz w:val="20"/>
+      </w:rPr>
+    </w:lvl>
+    <w:lvl w:ilvl="3" w:tentative="1">
+      <w:start w:val="1"/>
+      <w:numFmt w:val="bullet"/>
+      <w:lvlText w:val=""/>
+      <w:lvlJc w:val="left"/>
+      <w:pPr>
+        <w:tabs>
+          <w:tab w:val="num" w:pos="2880"/>
+        </w:tabs>
+        <w:ind w:left="2880" w:hanging="360"/>
+      </w:pPr>
+      <w:rPr>
+        <w:rFonts w:ascii="Wingdings" w:hAnsi="Wingdings" w:hint="default"/>
+        <w:sz w:val="20"/>
+      </w:rPr>
+    </w:lvl>
+    <w:lvl w:ilvl="4" w:tentative="1">
+      <w:start w:val="1"/>
+      <w:numFmt w:val="bullet"/>
+      <w:lvlText w:val=""/>
+      <w:lvlJc w:val="left"/>
+      <w:pPr>
+        <w:tabs>
+          <w:tab w:val="num" w:pos="3600"/>
+        </w:tabs>
+        <w:ind w:left="3600" w:hanging="360"/>
+      </w:pPr>
+      <w:rPr>
+        <w:rFonts w:ascii="Wingdings" w:hAnsi="Wingdings" w:hint="default"/>
+        <w:sz w:val="20"/>
+      </w:rPr>
+    </w:lvl>
+    <w:lvl w:ilvl="5" w:tentative="1">
+      <w:start w:val="1"/>
+      <w:numFmt w:val="bullet"/>
+      <w:lvlText w:val=""/>
+      <w:lvlJc w:val="left"/>
+      <w:pPr>
+        <w:tabs>
+          <w:tab w:val="num" w:pos="4320"/>
+        </w:tabs>
+        <w:ind w:left="4320" w:hanging="360"/>
+      </w:pPr>
+      <w:rPr>
+        <w:rFonts w:ascii="Wingdings" w:hAnsi="Wingdings" w:hint="default"/>
+        <w:sz w:val="20"/>
+      </w:rPr>
+    </w:lvl>
+    <w:lvl w:ilvl="6" w:tentative="1">
+      <w:start w:val="1"/>
+      <w:numFmt w:val="bullet"/>
+      <w:lvlText w:val=""/>
+      <w:lvlJc w:val="left"/>
+      <w:pPr>
+        <w:tabs>
+          <w:tab w:val="num" w:pos="5040"/>
+        </w:tabs>
+        <w:ind w:left="5040" w:hanging="360"/>
+      </w:pPr>
+      <w:rPr>
+        <w:rFonts w:ascii="Wingdings" w:hAnsi="Wingdings" w:hint="default"/>
+        <w:sz w:val="20"/>
+      </w:rPr>
+    </w:lvl>
+    <w:lvl w:ilvl="7" w:tentative="1">
+      <w:start w:val="1"/>
+      <w:numFmt w:val="bullet"/>
+      <w:lvlText w:val=""/>
+      <w:lvlJc w:val="left"/>
+      <w:pPr>
+        <w:tabs>
+          <w:tab w:val="num" w:pos="5760"/>
+        </w:tabs>
+        <w:ind w:left="5760" w:hanging="360"/>
+      </w:pPr>
+      <w:rPr>
+        <w:rFonts w:ascii="Wingdings" w:hAnsi="Wingdings" w:hint="default"/>
+        <w:sz w:val="20"/>
+      </w:rPr>
+    </w:lvl>
+    <w:lvl w:ilvl="8" w:tentative="1">
+      <w:start w:val="1"/>
+      <w:numFmt w:val="bullet"/>
+      <w:lvlText w:val=""/>
+      <w:lvlJc w:val="left"/>
+      <w:pPr>
+        <w:tabs>
+          <w:tab w:val="num" w:pos="6480"/>
+        </w:tabs>
+        <w:ind w:left="6480" w:hanging="360"/>
+      </w:pPr>
+      <w:rPr>
+        <w:rFonts w:ascii="Wingdings" w:hAnsi="Wingdings" w:hint="default"/>
+        <w:sz w:val="20"/>
+      </w:rPr>
+    </w:lvl>
+  </w:abstractNum>
+  <w:abstractNum w:abstractNumId="18" w15:restartNumberingAfterBreak="0">
     <w:nsid w:val="4A590B5E"/>
     <w:multiLevelType w:val="multilevel"/>
     <w:tmpl w:val="8C0E97CE"/>
@@ -6230,7 +7887,7 @@
       </w:rPr>
     </w:lvl>
   </w:abstractNum>
-  <w:abstractNum w:abstractNumId="13" w15:restartNumberingAfterBreak="0">
+  <w:abstractNum w:abstractNumId="19" w15:restartNumberingAfterBreak="0">
     <w:nsid w:val="512A060B"/>
     <w:multiLevelType w:val="multilevel"/>
     <w:tmpl w:val="051A39E2"/>
@@ -6379,7 +8036,7 @@
       </w:rPr>
     </w:lvl>
   </w:abstractNum>
-  <w:abstractNum w:abstractNumId="14" w15:restartNumberingAfterBreak="0">
+  <w:abstractNum w:abstractNumId="20" w15:restartNumberingAfterBreak="0">
     <w:nsid w:val="58951531"/>
     <w:multiLevelType w:val="multilevel"/>
     <w:tmpl w:val="69D6B010"/>
@@ -6528,7 +8185,7 @@
       </w:rPr>
     </w:lvl>
   </w:abstractNum>
-  <w:abstractNum w:abstractNumId="15" w15:restartNumberingAfterBreak="0">
+  <w:abstractNum w:abstractNumId="21" w15:restartNumberingAfterBreak="0">
     <w:nsid w:val="5CE74841"/>
     <w:multiLevelType w:val="multilevel"/>
     <w:tmpl w:val="49CEEBC4"/>
@@ -6677,7 +8334,305 @@
       </w:rPr>
     </w:lvl>
   </w:abstractNum>
-  <w:abstractNum w:abstractNumId="16" w15:restartNumberingAfterBreak="0">
+  <w:abstractNum w:abstractNumId="22" w15:restartNumberingAfterBreak="0">
+    <w:nsid w:val="609D2CBA"/>
+    <w:multiLevelType w:val="multilevel"/>
+    <w:tmpl w:val="2004BCB6"/>
+    <w:lvl w:ilvl="0">
+      <w:start w:val="1"/>
+      <w:numFmt w:val="bullet"/>
+      <w:lvlText w:val=""/>
+      <w:lvlJc w:val="left"/>
+      <w:pPr>
+        <w:tabs>
+          <w:tab w:val="num" w:pos="720"/>
+        </w:tabs>
+        <w:ind w:left="720" w:hanging="360"/>
+      </w:pPr>
+      <w:rPr>
+        <w:rFonts w:ascii="Symbol" w:hAnsi="Symbol" w:hint="default"/>
+        <w:sz w:val="20"/>
+      </w:rPr>
+    </w:lvl>
+    <w:lvl w:ilvl="1" w:tentative="1">
+      <w:start w:val="1"/>
+      <w:numFmt w:val="bullet"/>
+      <w:lvlText w:val="o"/>
+      <w:lvlJc w:val="left"/>
+      <w:pPr>
+        <w:tabs>
+          <w:tab w:val="num" w:pos="1440"/>
+        </w:tabs>
+        <w:ind w:left="1440" w:hanging="360"/>
+      </w:pPr>
+      <w:rPr>
+        <w:rFonts w:ascii="Courier New" w:hAnsi="Courier New" w:hint="default"/>
+        <w:sz w:val="20"/>
+      </w:rPr>
+    </w:lvl>
+    <w:lvl w:ilvl="2" w:tentative="1">
+      <w:start w:val="1"/>
+      <w:numFmt w:val="bullet"/>
+      <w:lvlText w:val=""/>
+      <w:lvlJc w:val="left"/>
+      <w:pPr>
+        <w:tabs>
+          <w:tab w:val="num" w:pos="2160"/>
+        </w:tabs>
+        <w:ind w:left="2160" w:hanging="360"/>
+      </w:pPr>
+      <w:rPr>
+        <w:rFonts w:ascii="Wingdings" w:hAnsi="Wingdings" w:hint="default"/>
+        <w:sz w:val="20"/>
+      </w:rPr>
+    </w:lvl>
+    <w:lvl w:ilvl="3" w:tentative="1">
+      <w:start w:val="1"/>
+      <w:numFmt w:val="bullet"/>
+      <w:lvlText w:val=""/>
+      <w:lvlJc w:val="left"/>
+      <w:pPr>
+        <w:tabs>
+          <w:tab w:val="num" w:pos="2880"/>
+        </w:tabs>
+        <w:ind w:left="2880" w:hanging="360"/>
+      </w:pPr>
+      <w:rPr>
+        <w:rFonts w:ascii="Wingdings" w:hAnsi="Wingdings" w:hint="default"/>
+        <w:sz w:val="20"/>
+      </w:rPr>
+    </w:lvl>
+    <w:lvl w:ilvl="4" w:tentative="1">
+      <w:start w:val="1"/>
+      <w:numFmt w:val="bullet"/>
+      <w:lvlText w:val=""/>
+      <w:lvlJc w:val="left"/>
+      <w:pPr>
+        <w:tabs>
+          <w:tab w:val="num" w:pos="3600"/>
+        </w:tabs>
+        <w:ind w:left="3600" w:hanging="360"/>
+      </w:pPr>
+      <w:rPr>
+        <w:rFonts w:ascii="Wingdings" w:hAnsi="Wingdings" w:hint="default"/>
+        <w:sz w:val="20"/>
+      </w:rPr>
+    </w:lvl>
+    <w:lvl w:ilvl="5" w:tentative="1">
+      <w:start w:val="1"/>
+      <w:numFmt w:val="bullet"/>
+      <w:lvlText w:val=""/>
+      <w:lvlJc w:val="left"/>
+      <w:pPr>
+        <w:tabs>
+          <w:tab w:val="num" w:pos="4320"/>
+        </w:tabs>
+        <w:ind w:left="4320" w:hanging="360"/>
+      </w:pPr>
+      <w:rPr>
+        <w:rFonts w:ascii="Wingdings" w:hAnsi="Wingdings" w:hint="default"/>
+        <w:sz w:val="20"/>
+      </w:rPr>
+    </w:lvl>
+    <w:lvl w:ilvl="6" w:tentative="1">
+      <w:start w:val="1"/>
+      <w:numFmt w:val="bullet"/>
+      <w:lvlText w:val=""/>
+      <w:lvlJc w:val="left"/>
+      <w:pPr>
+        <w:tabs>
+          <w:tab w:val="num" w:pos="5040"/>
+        </w:tabs>
+        <w:ind w:left="5040" w:hanging="360"/>
+      </w:pPr>
+      <w:rPr>
+        <w:rFonts w:ascii="Wingdings" w:hAnsi="Wingdings" w:hint="default"/>
+        <w:sz w:val="20"/>
+      </w:rPr>
+    </w:lvl>
+    <w:lvl w:ilvl="7" w:tentative="1">
+      <w:start w:val="1"/>
+      <w:numFmt w:val="bullet"/>
+      <w:lvlText w:val=""/>
+      <w:lvlJc w:val="left"/>
+      <w:pPr>
+        <w:tabs>
+          <w:tab w:val="num" w:pos="5760"/>
+        </w:tabs>
+        <w:ind w:left="5760" w:hanging="360"/>
+      </w:pPr>
+      <w:rPr>
+        <w:rFonts w:ascii="Wingdings" w:hAnsi="Wingdings" w:hint="default"/>
+        <w:sz w:val="20"/>
+      </w:rPr>
+    </w:lvl>
+    <w:lvl w:ilvl="8" w:tentative="1">
+      <w:start w:val="1"/>
+      <w:numFmt w:val="bullet"/>
+      <w:lvlText w:val=""/>
+      <w:lvlJc w:val="left"/>
+      <w:pPr>
+        <w:tabs>
+          <w:tab w:val="num" w:pos="6480"/>
+        </w:tabs>
+        <w:ind w:left="6480" w:hanging="360"/>
+      </w:pPr>
+      <w:rPr>
+        <w:rFonts w:ascii="Wingdings" w:hAnsi="Wingdings" w:hint="default"/>
+        <w:sz w:val="20"/>
+      </w:rPr>
+    </w:lvl>
+  </w:abstractNum>
+  <w:abstractNum w:abstractNumId="23" w15:restartNumberingAfterBreak="0">
+    <w:nsid w:val="6394749B"/>
+    <w:multiLevelType w:val="multilevel"/>
+    <w:tmpl w:val="65AE5488"/>
+    <w:lvl w:ilvl="0">
+      <w:start w:val="1"/>
+      <w:numFmt w:val="bullet"/>
+      <w:lvlText w:val=""/>
+      <w:lvlJc w:val="left"/>
+      <w:pPr>
+        <w:tabs>
+          <w:tab w:val="num" w:pos="720"/>
+        </w:tabs>
+        <w:ind w:left="720" w:hanging="360"/>
+      </w:pPr>
+      <w:rPr>
+        <w:rFonts w:ascii="Symbol" w:hAnsi="Symbol" w:hint="default"/>
+        <w:sz w:val="20"/>
+      </w:rPr>
+    </w:lvl>
+    <w:lvl w:ilvl="1" w:tentative="1">
+      <w:start w:val="1"/>
+      <w:numFmt w:val="bullet"/>
+      <w:lvlText w:val="o"/>
+      <w:lvlJc w:val="left"/>
+      <w:pPr>
+        <w:tabs>
+          <w:tab w:val="num" w:pos="1440"/>
+        </w:tabs>
+        <w:ind w:left="1440" w:hanging="360"/>
+      </w:pPr>
+      <w:rPr>
+        <w:rFonts w:ascii="Courier New" w:hAnsi="Courier New" w:hint="default"/>
+        <w:sz w:val="20"/>
+      </w:rPr>
+    </w:lvl>
+    <w:lvl w:ilvl="2" w:tentative="1">
+      <w:start w:val="1"/>
+      <w:numFmt w:val="bullet"/>
+      <w:lvlText w:val=""/>
+      <w:lvlJc w:val="left"/>
+      <w:pPr>
+        <w:tabs>
+          <w:tab w:val="num" w:pos="2160"/>
+        </w:tabs>
+        <w:ind w:left="2160" w:hanging="360"/>
+      </w:pPr>
+      <w:rPr>
+        <w:rFonts w:ascii="Wingdings" w:hAnsi="Wingdings" w:hint="default"/>
+        <w:sz w:val="20"/>
+      </w:rPr>
+    </w:lvl>
+    <w:lvl w:ilvl="3" w:tentative="1">
+      <w:start w:val="1"/>
+      <w:numFmt w:val="bullet"/>
+      <w:lvlText w:val=""/>
+      <w:lvlJc w:val="left"/>
+      <w:pPr>
+        <w:tabs>
+          <w:tab w:val="num" w:pos="2880"/>
+        </w:tabs>
+        <w:ind w:left="2880" w:hanging="360"/>
+      </w:pPr>
+      <w:rPr>
+        <w:rFonts w:ascii="Wingdings" w:hAnsi="Wingdings" w:hint="default"/>
+        <w:sz w:val="20"/>
+      </w:rPr>
+    </w:lvl>
+    <w:lvl w:ilvl="4" w:tentative="1">
+      <w:start w:val="1"/>
+      <w:numFmt w:val="bullet"/>
+      <w:lvlText w:val=""/>
+      <w:lvlJc w:val="left"/>
+      <w:pPr>
+        <w:tabs>
+          <w:tab w:val="num" w:pos="3600"/>
+        </w:tabs>
+        <w:ind w:left="3600" w:hanging="360"/>
+      </w:pPr>
+      <w:rPr>
+        <w:rFonts w:ascii="Wingdings" w:hAnsi="Wingdings" w:hint="default"/>
+        <w:sz w:val="20"/>
+      </w:rPr>
+    </w:lvl>
+    <w:lvl w:ilvl="5" w:tentative="1">
+      <w:start w:val="1"/>
+      <w:numFmt w:val="bullet"/>
+      <w:lvlText w:val=""/>
+      <w:lvlJc w:val="left"/>
+      <w:pPr>
+        <w:tabs>
+          <w:tab w:val="num" w:pos="4320"/>
+        </w:tabs>
+        <w:ind w:left="4320" w:hanging="360"/>
+      </w:pPr>
+      <w:rPr>
+        <w:rFonts w:ascii="Wingdings" w:hAnsi="Wingdings" w:hint="default"/>
+        <w:sz w:val="20"/>
+      </w:rPr>
+    </w:lvl>
+    <w:lvl w:ilvl="6" w:tentative="1">
+      <w:start w:val="1"/>
+      <w:numFmt w:val="bullet"/>
+      <w:lvlText w:val=""/>
+      <w:lvlJc w:val="left"/>
+      <w:pPr>
+        <w:tabs>
+          <w:tab w:val="num" w:pos="5040"/>
+        </w:tabs>
+        <w:ind w:left="5040" w:hanging="360"/>
+      </w:pPr>
+      <w:rPr>
+        <w:rFonts w:ascii="Wingdings" w:hAnsi="Wingdings" w:hint="default"/>
+        <w:sz w:val="20"/>
+      </w:rPr>
+    </w:lvl>
+    <w:lvl w:ilvl="7" w:tentative="1">
+      <w:start w:val="1"/>
+      <w:numFmt w:val="bullet"/>
+      <w:lvlText w:val=""/>
+      <w:lvlJc w:val="left"/>
+      <w:pPr>
+        <w:tabs>
+          <w:tab w:val="num" w:pos="5760"/>
+        </w:tabs>
+        <w:ind w:left="5760" w:hanging="360"/>
+      </w:pPr>
+      <w:rPr>
+        <w:rFonts w:ascii="Wingdings" w:hAnsi="Wingdings" w:hint="default"/>
+        <w:sz w:val="20"/>
+      </w:rPr>
+    </w:lvl>
+    <w:lvl w:ilvl="8" w:tentative="1">
+      <w:start w:val="1"/>
+      <w:numFmt w:val="bullet"/>
+      <w:lvlText w:val=""/>
+      <w:lvlJc w:val="left"/>
+      <w:pPr>
+        <w:tabs>
+          <w:tab w:val="num" w:pos="6480"/>
+        </w:tabs>
+        <w:ind w:left="6480" w:hanging="360"/>
+      </w:pPr>
+      <w:rPr>
+        <w:rFonts w:ascii="Wingdings" w:hAnsi="Wingdings" w:hint="default"/>
+        <w:sz w:val="20"/>
+      </w:rPr>
+    </w:lvl>
+  </w:abstractNum>
+  <w:abstractNum w:abstractNumId="24" w15:restartNumberingAfterBreak="0">
     <w:nsid w:val="6880535F"/>
     <w:multiLevelType w:val="multilevel"/>
     <w:tmpl w:val="3F86487C"/>
@@ -6826,7 +8781,7 @@
       </w:rPr>
     </w:lvl>
   </w:abstractNum>
-  <w:abstractNum w:abstractNumId="17" w15:restartNumberingAfterBreak="0">
+  <w:abstractNum w:abstractNumId="25" w15:restartNumberingAfterBreak="0">
     <w:nsid w:val="6FAC763C"/>
     <w:multiLevelType w:val="multilevel"/>
     <w:tmpl w:val="46906658"/>
@@ -6975,7 +8930,7 @@
       </w:rPr>
     </w:lvl>
   </w:abstractNum>
-  <w:abstractNum w:abstractNumId="18" w15:restartNumberingAfterBreak="0">
+  <w:abstractNum w:abstractNumId="26" w15:restartNumberingAfterBreak="0">
     <w:nsid w:val="73A26CBA"/>
     <w:multiLevelType w:val="multilevel"/>
     <w:tmpl w:val="F2DEE35C"/>
@@ -7124,7 +9079,7 @@
       </w:rPr>
     </w:lvl>
   </w:abstractNum>
-  <w:abstractNum w:abstractNumId="19" w15:restartNumberingAfterBreak="0">
+  <w:abstractNum w:abstractNumId="27" w15:restartNumberingAfterBreak="0">
     <w:nsid w:val="7C1E695D"/>
     <w:multiLevelType w:val="multilevel"/>
     <w:tmpl w:val="DC6E040E"/>
@@ -7430,31 +9385,31 @@
     <w:abstractNumId w:val="0"/>
   </w:num>
   <w:num w:numId="53" w16cid:durableId="648898657">
-    <w:abstractNumId w:val="5"/>
+    <w:abstractNumId w:val="6"/>
   </w:num>
   <w:num w:numId="54" w16cid:durableId="196743812">
-    <w:abstractNumId w:val="7"/>
+    <w:abstractNumId w:val="8"/>
   </w:num>
   <w:num w:numId="55" w16cid:durableId="845092362">
     <w:abstractNumId w:val="4"/>
   </w:num>
   <w:num w:numId="56" w16cid:durableId="1245067159">
+    <w:abstractNumId w:val="14"/>
+  </w:num>
+  <w:num w:numId="57" w16cid:durableId="2090885627">
+    <w:abstractNumId w:val="20"/>
+  </w:num>
+  <w:num w:numId="58" w16cid:durableId="843939731">
     <w:abstractNumId w:val="11"/>
   </w:num>
-  <w:num w:numId="57" w16cid:durableId="2090885627">
-    <w:abstractNumId w:val="14"/>
+  <w:num w:numId="59" w16cid:durableId="1733385650">
+    <w:abstractNumId w:val="27"/>
   </w:num>
-  <w:num w:numId="58" w16cid:durableId="843939731">
-    <w:abstractNumId w:val="9"/>
-  </w:num>
-  <w:num w:numId="59" w16cid:durableId="1733385650">
+  <w:num w:numId="60" w16cid:durableId="250505267">
     <w:abstractNumId w:val="19"/>
   </w:num>
-  <w:num w:numId="60" w16cid:durableId="250505267">
+  <w:num w:numId="61" w16cid:durableId="935795136">
     <w:abstractNumId w:val="13"/>
-  </w:num>
-  <w:num w:numId="61" w16cid:durableId="935795136">
-    <w:abstractNumId w:val="10"/>
   </w:num>
   <w:num w:numId="62" w16cid:durableId="579603686">
     <w:abstractNumId w:val="1"/>
@@ -7463,28 +9418,52 @@
     <w:abstractNumId w:val="2"/>
   </w:num>
   <w:num w:numId="64" w16cid:durableId="1857230506">
+    <w:abstractNumId w:val="26"/>
+  </w:num>
+  <w:num w:numId="65" w16cid:durableId="1748459347">
+    <w:abstractNumId w:val="7"/>
+  </w:num>
+  <w:num w:numId="66" w16cid:durableId="304549223">
     <w:abstractNumId w:val="18"/>
   </w:num>
-  <w:num w:numId="65" w16cid:durableId="1748459347">
-    <w:abstractNumId w:val="6"/>
-  </w:num>
-  <w:num w:numId="66" w16cid:durableId="304549223">
-    <w:abstractNumId w:val="12"/>
-  </w:num>
   <w:num w:numId="67" w16cid:durableId="763263830">
-    <w:abstractNumId w:val="15"/>
+    <w:abstractNumId w:val="21"/>
   </w:num>
   <w:num w:numId="68" w16cid:durableId="312375837">
-    <w:abstractNumId w:val="16"/>
+    <w:abstractNumId w:val="24"/>
   </w:num>
   <w:num w:numId="69" w16cid:durableId="1863743333">
-    <w:abstractNumId w:val="17"/>
+    <w:abstractNumId w:val="25"/>
   </w:num>
   <w:num w:numId="70" w16cid:durableId="255290651">
-    <w:abstractNumId w:val="8"/>
+    <w:abstractNumId w:val="9"/>
   </w:num>
   <w:num w:numId="71" w16cid:durableId="578637345">
     <w:abstractNumId w:val="3"/>
+  </w:num>
+  <w:num w:numId="72" w16cid:durableId="118959632">
+    <w:abstractNumId w:val="17"/>
+  </w:num>
+  <w:num w:numId="73" w16cid:durableId="956568214">
+    <w:abstractNumId w:val="15"/>
+  </w:num>
+  <w:num w:numId="74" w16cid:durableId="87431294">
+    <w:abstractNumId w:val="16"/>
+  </w:num>
+  <w:num w:numId="75" w16cid:durableId="20250941">
+    <w:abstractNumId w:val="22"/>
+  </w:num>
+  <w:num w:numId="76" w16cid:durableId="1269315234">
+    <w:abstractNumId w:val="12"/>
+  </w:num>
+  <w:num w:numId="77" w16cid:durableId="1102531594">
+    <w:abstractNumId w:val="5"/>
+  </w:num>
+  <w:num w:numId="78" w16cid:durableId="512114319">
+    <w:abstractNumId w:val="23"/>
+  </w:num>
+  <w:num w:numId="79" w16cid:durableId="1136994984">
+    <w:abstractNumId w:val="10"/>
   </w:num>
   <w:numIdMacAtCleanup w:val="71"/>
 </w:numbering>

</xml_diff>